<commit_message>
LUMEN paper: E1 result in Abstract and Highlights; Abstract tightened to 189 words
- Every E1/E2/E4/E6 number filled by the finishing session was checked against tables
  step13/14/15 (Table 6 P1 = seed 42 run; P2 tests; E6 coverage; E4 summary).
- The Abstract and Highlights now carry the confirmatory E1 result: significantly better than a
  tuned RF on 8/13 targets, FeO 1.23 vs 2.13 wt%.
- The Abstract is rewritten to the Remote Sensing length (about 200 words), with every headline
  number kept, the negative orbital result included.

Co-Authored-By: Claude Opus 5.5 <noreply@anthropic.com>
</commit_message>
<xml_diff>
--- a/LUMEN_HybridDL/paper/MANUSCRIPT.docx
+++ b/LUMEN_HybridDL/paper/MANUSCRIPT.docx
@@ -165,6 +165,24 @@
         </w:numPr>
       </w:pPr>
       <w:r>
+        <w:t xml:space="preserve">With its configuration chosen inside the cross-validation, it is significantly more accurate</w:t>
+      </w:r>
+      <w:r>
+        <w:t xml:space="preserve"> </w:t>
+      </w:r>
+      <w:r>
+        <w:t xml:space="preserve">than a tuned random forest on 8 of 13 laboratory targets.</w:t>
+      </w:r>
+    </w:p>
+    <w:p>
+      <w:pPr>
+        <w:pStyle w:val="Compact"/>
+        <w:numPr>
+          <w:ilvl w:val="0"/>
+          <w:numId w:val="1001"/>
+        </w:numPr>
+      </w:pPr>
+      <w:r>
         <w:t xml:space="preserve">Conformal calibration gives intervals with nominal coverage. An identifiability gate withholds</w:t>
       </w:r>
       <w:r>
@@ -261,145 +279,7 @@
         <w:pStyle w:val="FirstParagraph"/>
       </w:pPr>
       <w:r>
-        <w:t xml:space="preserve">Retrievals of lunar surface composition from reflectance spectra fall into three groups:</w:t>
-      </w:r>
-      <w:r>
-        <w:t xml:space="preserve"> </w:t>
-      </w:r>
-      <w:r>
-        <w:t xml:space="preserve">- empirical band-ratio and machine-learning regressions calibrated on a few dozen returned-sample</w:t>
-      </w:r>
-      <w:r>
-        <w:t xml:space="preserve"> </w:t>
-      </w:r>
-      <w:r>
-        <w:t xml:space="preserve">sites;</w:t>
-      </w:r>
-      <w:r>
-        <w:t xml:space="preserve"> </w:t>
-      </w:r>
-      <w:r>
-        <w:t xml:space="preserve">- radiative-transfer inversions;</w:t>
-      </w:r>
-      <w:r>
-        <w:t xml:space="preserve"> </w:t>
-      </w:r>
-      <w:r>
-        <w:t xml:space="preserve">- physics-guided neural networks.</w:t>
-      </w:r>
-    </w:p>
-    <w:p>
-      <w:pPr>
-        <w:pStyle w:val="BodyText"/>
-      </w:pPr>
-      <w:r>
-        <w:t xml:space="preserve">They are rarely compared on identical data, and their uncertainties are seldom calibrated. We</w:t>
-      </w:r>
-      <w:r>
-        <w:t xml:space="preserve"> </w:t>
-      </w:r>
-      <w:r>
-        <w:t xml:space="preserve">present LUMEN (LUnar Mineralogy Estimation Network), a hybrid of physics simulation and deep</w:t>
-      </w:r>
-      <w:r>
-        <w:t xml:space="preserve"> </w:t>
-      </w:r>
-      <w:r>
-        <w:t xml:space="preserve">learning:</w:t>
-      </w:r>
-      <w:r>
-        <w:t xml:space="preserve"> </w:t>
-      </w:r>
-      <w:r>
-        <w:t xml:space="preserve">- a domain-randomised Hapke simulator, built from 49 lunar mineral and glass spectra and including</w:t>
-      </w:r>
-      <w:r>
-        <w:t xml:space="preserve"> </w:t>
-      </w:r>
-      <w:r>
-        <w:t xml:space="preserve">nanophase-iron space weathering, generates 400,000 synthetic soils;</w:t>
-      </w:r>
-      <w:r>
-        <w:t xml:space="preserve"> </w:t>
-      </w:r>
-      <w:r>
-        <w:t xml:space="preserve">- a compact one-dimensional convolutional network is pretrained on them, then fine-tuned on</w:t>
-      </w:r>
-      <w:r>
-        <w:t xml:space="preserve"> </w:t>
-      </w:r>
-      <w:r>
-        <w:t xml:space="preserve">laboratory spectra of the 19 Lunar Soil Characterization Consortium soils;</w:t>
-      </w:r>
-      <w:r>
-        <w:t xml:space="preserve"> </w:t>
-      </w:r>
-      <w:r>
-        <w:t xml:space="preserve">- a deep ensemble with conformal calibration supplies prediction intervals;</w:t>
-      </w:r>
-      <w:r>
-        <w:t xml:space="preserve"> </w:t>
-      </w:r>
-      <w:r>
-        <w:t xml:space="preserve">- an identifiability gate withholds outputs without demonstrable skill.</w:t>
-      </w:r>
-    </w:p>
-    <w:p>
-      <w:pPr>
-        <w:pStyle w:val="BodyText"/>
-      </w:pPr>
-      <w:r>
-        <w:t xml:space="preserve">Under leave-one-soil-out evaluation, with the protocol fixed and committed before scoring, LUMEN</w:t>
-      </w:r>
-      <w:r>
-        <w:t xml:space="preserve"> </w:t>
-      </w:r>
-      <w:r>
-        <w:t xml:space="preserve">predicts FeO to 1.26 wt% and TiO₂ to 0.70 wt%. It reduces the FeO error of a re-implemented</w:t>
-      </w:r>
-      <w:r>
-        <w:t xml:space="preserve"> </w:t>
-      </w:r>
-      <w:r>
-        <w:t xml:space="preserve">wavelet–autoencoder pipeline by 42% (1.26 vs. 2.17 wt%) and the mineral-proportion errors of a</w:t>
-      </w:r>
-      <w:r>
-        <w:t xml:space="preserve"> </w:t>
-      </w:r>
-      <w:r>
-        <w:t xml:space="preserve">Shkuratov-model inversion by 54–74%. Conformal intervals reach nominal coverage. Olivine is not</w:t>
-      </w:r>
-      <w:r>
-        <w:t xml:space="preserve"> </w:t>
-      </w:r>
-      <w:r>
-        <w:t xml:space="preserve">identifiable from these spectra.</w:t>
-      </w:r>
-    </w:p>
-    <w:p>
-      <w:pPr>
-        <w:pStyle w:val="BodyText"/>
-      </w:pPr>
-      <w:r>
-        <w:t xml:space="preserve">On M³ spectra at 49 returned-sample sites, a lab-only model does not transfer (FeO MAE 6.81</w:t>
-      </w:r>
-      <w:r>
-        <w:t xml:space="preserve"> </w:t>
-      </w:r>
-      <w:r>
-        <w:t xml:space="preserve">wt%). With orbital fine-tuning it reaches 3.27 wt% (R² = 0.34) under leave-one-landing-site-out:</w:t>
-      </w:r>
-      <w:r>
-        <w:t xml:space="preserve"> </w:t>
-      </w:r>
-      <w:r>
-        <w:t xml:space="preserve">below the published pipeline’s 3.58 wt%, but not significantly (Holm p = 1.00). Two-band linear</w:t>
-      </w:r>
-      <w:r>
-        <w:t xml:space="preserve"> </w:t>
-      </w:r>
-      <w:r>
-        <w:t xml:space="preserve">regressions are significantly more accurate (M³: 2.11 wt%; Clementine: 1.82 wt%).</w:t>
+        <w:t xml:space="preserve">Lunar soil composition is retrieved from reflectance spectra by empirical regressions, radiative-transfer inversions and physics-guided networks, which are rarely compared on identical data or given calibrated uncertainties. We present LUMEN, a one-dimensional convolutional network pretrained on 400,000 soils from a domain-randomised Hapke simulator with nanophase-iron space weathering, fine-tuned on laboratory spectra of the 19 Lunar Soil Characterization Consortium soils, with conformal prediction intervals and an identifiability gate that withholds outputs without demonstrable skill. Under leave-one-soil-out evaluation with a protocol fixed before scoring, LUMEN predicts FeO to 1.26 wt% and TiO₂ to 0.70 wt%, reduces the FeO error of a published wavelet–autoencoder pipeline by 42% and the mineral-proportion errors of a Shkuratov-model inversion by 54–74%, and, with its configuration chosen inside the cross-validation, is significantly more accurate than a tuned random forest on 8 of 13 targets. Intervals reach nominal coverage; olivine is not identifiable. On Moon Mineralogy Mapper spectra at 49 returned-sample sites, the laboratory model does not transfer (6.81 wt%); after orbital fine-tuning it reaches 3.27 wt% under leave-one-landing-site-out, not significantly better than the published pipeline (3.58 wt%) and significantly worse than a two-band linear regression (2.11 wt%).</w:t>
       </w:r>
     </w:p>
     <w:p>

</xml_diff>

<commit_message>
LUMEN paper: manuscript in MDPI's official Remote Sensing Word template
- paper/MANUSCRIPT_MDPI.docx is built by paper/build_mdpi_docx.py from MANUSCRIPT.md into MDPI's
  own template (paper/mdpi_template/remotesensing-template.dot, from mdpi-res.com). It uses the
  template's page set-up, headers, footers, line numbers, front-page side box and MDPI_* styles.
  Equations go into MDPI's two-cell numbered equation tables (Office Math via pandoc), tables are
  three-line, figures full width, and references auto-numbered. Rendered through Word and checked
  page by page: 27 pages.
- MDPI compliance edits to the text: the Highlights have 2 bullets per part (the template's
  limit), with no claim changed; the generative-AI disclosure moves to Materials and Methods
  (Section 2.4), where MDPI requires it; the back matter is written as single paragraphs. Author,
  affiliation and funding fields keep MDPI's placeholders.

Co-Authored-By: Claude Opus 5.5 <noreply@anthropic.com>
</commit_message>
<xml_diff>
--- a/LUMEN_HybridDL/paper/MANUSCRIPT.docx
+++ b/LUMEN_HybridDL/paper/MANUSCRIPT.docx
@@ -2,7 +2,7 @@
 <file path=word/document.xml><?xml version="1.0" encoding="utf-8"?>
 <w:document xmlns:w="http://schemas.openxmlformats.org/wordprocessingml/2006/main" xmlns:m="http://schemas.openxmlformats.org/officeDocument/2006/math" xmlns:r="http://schemas.openxmlformats.org/officeDocument/2006/relationships" xmlns:o="urn:schemas-microsoft-com:office:office" xmlns:v="urn:schemas-microsoft-com:vml" xmlns:w10="urn:schemas-microsoft-com:office:word" xmlns:a="http://schemas.openxmlformats.org/drawingml/2006/main" xmlns:pic="http://schemas.openxmlformats.org/drawingml/2006/picture" xmlns:wp="http://schemas.openxmlformats.org/drawingml/2006/wordprocessingDrawing">
   <w:body>
-    <w:bookmarkStart w:id="70" w:name="X1b940ee9ca712b8874ab3c96a4cef274b19d27e"/>
+    <w:bookmarkStart w:id="71" w:name="X1b940ee9ca712b8874ab3c96a4cef274b19d27e"/>
     <w:p>
       <w:pPr>
         <w:pStyle w:val="Heading1"/>
@@ -87,55 +87,7 @@
         </w:numPr>
       </w:pPr>
       <w:r>
-        <w:t xml:space="preserve">LUMEN is a one-dimensional convolutional network. It is pretrained on 400,000 Hapke-simulated</w:t>
-      </w:r>
-      <w:r>
-        <w:t xml:space="preserve"> </w:t>
-      </w:r>
-      <w:r>
-        <w:t xml:space="preserve">lunar soils and fine-tuned on 19 returned soils. From a spectrum on the Moon Mineralogy Mapper</w:t>
-      </w:r>
-      <w:r>
-        <w:t xml:space="preserve"> </w:t>
-      </w:r>
-      <w:r>
-        <w:t xml:space="preserve">(M³) band set it predicts:</w:t>
-      </w:r>
-    </w:p>
-    <w:p>
-      <w:pPr>
-        <w:pStyle w:val="Compact"/>
-        <w:numPr>
-          <w:ilvl w:val="1"/>
-          <w:numId w:val="1002"/>
-        </w:numPr>
-      </w:pPr>
-      <w:r>
-        <w:t xml:space="preserve">FeO, TiO₂, Al₂O₃, CaO and MgO;</w:t>
-      </w:r>
-    </w:p>
-    <w:p>
-      <w:pPr>
-        <w:pStyle w:val="Compact"/>
-        <w:numPr>
-          <w:ilvl w:val="1"/>
-          <w:numId w:val="1002"/>
-        </w:numPr>
-      </w:pPr>
-      <w:r>
-        <w:t xml:space="preserve">a seven-part modal mineralogy;</w:t>
-      </w:r>
-    </w:p>
-    <w:p>
-      <w:pPr>
-        <w:pStyle w:val="Compact"/>
-        <w:numPr>
-          <w:ilvl w:val="1"/>
-          <w:numId w:val="1002"/>
-        </w:numPr>
-      </w:pPr>
-      <w:r>
-        <w:t xml:space="preserve">soil maturity.</w:t>
+        <w:t xml:space="preserve">LUMEN, a one-dimensional network pretrained on 400,000 Hapke-simulated lunar soils and fine-tuned on 19 returned soils, predicts FeO, four other oxides, seven-part mineralogy and maturity from M³-band spectra. On identical laboratory data it cuts FeO error by 42% relative to a published wavelet–autoencoder pipeline, and it is significantly more accurate than a tuned random forest on 8 of 13 targets.</w:t>
       </w:r>
     </w:p>
     <w:p>
@@ -147,13 +99,19 @@
         </w:numPr>
       </w:pPr>
       <w:r>
-        <w:t xml:space="preserve">On identical laboratory spectra and folds, it reduces FeO error by 42% relative to a published</w:t>
-      </w:r>
-      <w:r>
-        <w:t xml:space="preserve"> </w:t>
-      </w:r>
-      <w:r>
-        <w:t xml:space="preserve">wavelet–autoencoder pipeline.</w:t>
+        <w:t xml:space="preserve">Conformal intervals reach nominal coverage. An identifiability gate withholds olivine and minor glasses, which no method predicts better than a zero-information baseline.</w:t>
+      </w:r>
+    </w:p>
+    <w:p>
+      <w:pPr>
+        <w:pStyle w:val="FirstParagraph"/>
+      </w:pPr>
+      <w:r>
+        <w:rPr>
+          <w:b/>
+          <w:bCs/>
+        </w:rPr>
+        <w:t xml:space="preserve">What are the implications of the main findings?</w:t>
       </w:r>
     </w:p>
     <w:p>
@@ -161,17 +119,11 @@
         <w:pStyle w:val="Compact"/>
         <w:numPr>
           <w:ilvl w:val="0"/>
-          <w:numId w:val="1001"/>
+          <w:numId w:val="1002"/>
         </w:numPr>
       </w:pPr>
       <w:r>
-        <w:t xml:space="preserve">With its configuration chosen inside the cross-validation, it is significantly more accurate</w:t>
-      </w:r>
-      <w:r>
-        <w:t xml:space="preserve"> </w:t>
-      </w:r>
-      <w:r>
-        <w:t xml:space="preserve">than a tuned random forest on 8 of 13 laboratory targets.</w:t>
+        <w:t xml:space="preserve">Most of the error of physics-only inversions is removed by calibrating against returned soils, not by adding model complexity.</w:t>
       </w:r>
     </w:p>
     <w:p>
@@ -179,35 +131,692 @@
         <w:pStyle w:val="Compact"/>
         <w:numPr>
           <w:ilvl w:val="0"/>
-          <w:numId w:val="1001"/>
+          <w:numId w:val="1002"/>
         </w:numPr>
       </w:pPr>
       <w:r>
-        <w:t xml:space="preserve">Conformal calibration gives intervals with nominal coverage. An identifiability gate withholds</w:t>
-      </w:r>
-      <w:r>
-        <w:t xml:space="preserve"> </w:t>
-      </w:r>
-      <w:r>
-        <w:t xml:space="preserve">the two targets that no method predicts better than a zero-information baseline (olivine and</w:t>
-      </w:r>
-      <w:r>
-        <w:t xml:space="preserve"> </w:t>
-      </w:r>
-      <w:r>
-        <w:t xml:space="preserve">minor glasses).</w:t>
+        <w:t xml:space="preserve">Laboratory skill does not transfer to orbit. At 49 returned-sample sites, orbitally fine-tuned LUMEN (3.27 wt% FeO) is not significantly better than the published pipeline (3.58 wt%) and is outperformed by a two-band linear regression (2.11 wt%).</w:t>
+      </w:r>
+    </w:p>
+    <w:bookmarkEnd w:id="9"/>
+    <w:bookmarkStart w:id="10" w:name="abstract"/>
+    <w:p>
+      <w:pPr>
+        <w:pStyle w:val="Heading2"/>
+      </w:pPr>
+      <w:r>
+        <w:t xml:space="preserve">Abstract</w:t>
       </w:r>
     </w:p>
     <w:p>
       <w:pPr>
         <w:pStyle w:val="FirstParagraph"/>
+      </w:pPr>
+      <w:r>
+        <w:t xml:space="preserve">Lunar soil composition is retrieved from reflectance spectra by empirical regressions, radiative-transfer inversions and physics-guided networks, which are rarely compared on identical data or given calibrated uncertainties. We present LUMEN, a one-dimensional convolutional network pretrained on 400,000 soils from a domain-randomised Hapke simulator with nanophase-iron space weathering, fine-tuned on laboratory spectra of the 19 Lunar Soil Characterization Consortium soils, with conformal prediction intervals and an identifiability gate that withholds outputs without demonstrable skill. Under leave-one-soil-out evaluation with a protocol fixed before scoring, LUMEN predicts FeO to 1.26 wt% and TiO₂ to 0.70 wt%, reduces the FeO error of a published wavelet–autoencoder pipeline by 42% and the mineral-proportion errors of a Shkuratov-model inversion by 54–74%, and, with its configuration chosen inside the cross-validation, is significantly more accurate than a tuned random forest on 8 of 13 targets. Intervals reach nominal coverage; olivine is not identifiable. On Moon Mineralogy Mapper spectra at 49 returned-sample sites, the laboratory model does not transfer (6.81 wt%); after orbital fine-tuning it reaches 3.27 wt% under leave-one-landing-site-out, not significantly better than the published pipeline (3.58 wt%) and significantly worse than a two-band linear regression (2.11 wt%).</w:t>
+      </w:r>
+    </w:p>
+    <w:p>
+      <w:pPr>
+        <w:pStyle w:val="BodyText"/>
       </w:pPr>
       <w:r>
         <w:rPr>
           <w:b/>
           <w:bCs/>
         </w:rPr>
-        <w:t xml:space="preserve">What are the implications of the main findings?</w:t>
+        <w:t xml:space="preserve">Keywords:</w:t>
+      </w:r>
+      <w:r>
+        <w:t xml:space="preserve"> </w:t>
+      </w:r>
+      <w:r>
+        <w:t xml:space="preserve">lunar regolith; FeO; mineral abundance; space weathering; Moon Mineralogy Mapper;</w:t>
+      </w:r>
+      <w:r>
+        <w:t xml:space="preserve"> </w:t>
+      </w:r>
+      <w:r>
+        <w:t xml:space="preserve">Hapke model; deep learning; transfer learning; conformal prediction; uncertainty quantification</w:t>
+      </w:r>
+    </w:p>
+    <w:bookmarkEnd w:id="10"/>
+    <w:bookmarkStart w:id="11" w:name="introduction"/>
+    <w:p>
+      <w:pPr>
+        <w:pStyle w:val="Heading2"/>
+      </w:pPr>
+      <w:r>
+        <w:t xml:space="preserve">1. Introduction</w:t>
+      </w:r>
+    </w:p>
+    <w:p>
+      <w:pPr>
+        <w:pStyle w:val="FirstParagraph"/>
+      </w:pPr>
+      <w:r>
+        <w:t xml:space="preserve">Some properties of the lunar regolith can be read remotely, and they are central to lunar science</w:t>
+      </w:r>
+      <w:r>
+        <w:t xml:space="preserve"> </w:t>
+      </w:r>
+      <w:r>
+        <w:t xml:space="preserve">and to planning in situ resource use:</w:t>
+      </w:r>
+      <w:r>
+        <w:t xml:space="preserve"> </w:t>
+      </w:r>
+      <w:r>
+        <w:t xml:space="preserve">- its iron and titanium content;</w:t>
+      </w:r>
+      <w:r>
+        <w:t xml:space="preserve"> </w:t>
+      </w:r>
+      <w:r>
+        <w:t xml:space="preserve">- its modal mineralogy;</w:t>
+      </w:r>
+      <w:r>
+        <w:t xml:space="preserve"> </w:t>
+      </w:r>
+      <w:r>
+        <w:t xml:space="preserve">- its exposure to space weathering.</w:t>
+      </w:r>
+    </w:p>
+    <w:p>
+      <w:pPr>
+        <w:pStyle w:val="BodyText"/>
+      </w:pPr>
+      <w:r>
+        <w:t xml:space="preserve">The Moon Mineralogy Mapper (M³) on Chandrayaan-1 acquired visible to near-infrared reflectance</w:t>
+      </w:r>
+      <w:r>
+        <w:t xml:space="preserve"> </w:t>
+      </w:r>
+      <w:r>
+        <w:t xml:space="preserve">spectra over most of the lunar surface [1,2]. These spectra carry the</w:t>
+      </w:r>
+      <w:r>
+        <w:t xml:space="preserve"> </w:t>
+      </w:r>
+      <w:r>
+        <w:t xml:space="preserve">crystal-field absorptions of Fe²⁺ in pyroxene and olivine near 1 and 2 µm, together with the</w:t>
+      </w:r>
+      <w:r>
+        <w:t xml:space="preserve"> </w:t>
+      </w:r>
+      <w:r>
+        <w:t xml:space="preserve">darkening and reddening produced by nanophase metallic iron. Turning such spectra into</w:t>
+      </w:r>
+      <w:r>
+        <w:t xml:space="preserve"> </w:t>
+      </w:r>
+      <w:r>
+        <w:t xml:space="preserve">quantitative composition remains an inverse problem with little ground truth.</w:t>
+      </w:r>
+    </w:p>
+    <w:p>
+      <w:pPr>
+        <w:pStyle w:val="BodyText"/>
+      </w:pPr>
+      <w:r>
+        <w:rPr>
+          <w:b/>
+          <w:bCs/>
+        </w:rPr>
+        <w:t xml:space="preserve">Empirical methods</w:t>
+      </w:r>
+      <w:r>
+        <w:t xml:space="preserve"> </w:t>
+      </w:r>
+      <w:r>
+        <w:t xml:space="preserve">relate spectral parameters to the composition of returned samples at their</w:t>
+      </w:r>
+      <w:r>
+        <w:t xml:space="preserve"> </w:t>
+      </w:r>
+      <w:r>
+        <w:t xml:space="preserve">landing sites.</w:t>
+      </w:r>
+      <w:r>
+        <w:t xml:space="preserve"> </w:t>
+      </w:r>
+      <w:r>
+        <w:t xml:space="preserve">-</w:t>
+      </w:r>
+      <w:r>
+        <w:t xml:space="preserve"> </w:t>
+      </w:r>
+      <w:r>
+        <w:rPr>
+          <w:i/>
+          <w:iCs/>
+        </w:rPr>
+        <w:t xml:space="preserve">Band ratios and band parameters.</w:t>
+      </w:r>
+      <w:r>
+        <w:t xml:space="preserve"> </w:t>
+      </w:r>
+      <w:r>
+        <w:t xml:space="preserve">The Clementine band-ratio algorithms of Lucey et al.</w:t>
+      </w:r>
+      <w:r>
+        <w:t xml:space="preserve"> </w:t>
+      </w:r>
+      <w:r>
+        <w:t xml:space="preserve">[3] remain the reference for FeO and TiO₂. Band-depth and band-centre parameters of</w:t>
+      </w:r>
+      <w:r>
+        <w:t xml:space="preserve"> </w:t>
+      </w:r>
+      <w:r>
+        <w:t xml:space="preserve">the 1 and 2 µm absorptions have been calibrated for M³ [4,5].</w:t>
+      </w:r>
+      <w:r>
+        <w:t xml:space="preserve"> </w:t>
+      </w:r>
+      <w:r>
+        <w:t xml:space="preserve">-</w:t>
+      </w:r>
+      <w:r>
+        <w:t xml:space="preserve"> </w:t>
+      </w:r>
+      <w:r>
+        <w:rPr>
+          <w:i/>
+          <w:iCs/>
+        </w:rPr>
+        <w:t xml:space="preserve">Regression and machine learning.</w:t>
+      </w:r>
+      <w:r>
+        <w:t xml:space="preserve"> </w:t>
+      </w:r>
+      <w:r>
+        <w:t xml:space="preserve">Methods range from partial least squares [6] and</w:t>
+      </w:r>
+      <w:r>
+        <w:t xml:space="preserve"> </w:t>
+      </w:r>
+      <w:r>
+        <w:t xml:space="preserve">neural networks [7] to support vector machines [8] and systematic comparisons of</w:t>
+      </w:r>
+      <w:r>
+        <w:t xml:space="preserve"> </w:t>
+      </w:r>
+      <w:r>
+        <w:t xml:space="preserve">regressors [9].</w:t>
+      </w:r>
+      <w:r>
+        <w:t xml:space="preserve"> </w:t>
+      </w:r>
+      <w:r>
+        <w:t xml:space="preserve">-</w:t>
+      </w:r>
+      <w:r>
+        <w:t xml:space="preserve"> </w:t>
+      </w:r>
+      <w:r>
+        <w:rPr>
+          <w:i/>
+          <w:iCs/>
+        </w:rPr>
+        <w:t xml:space="preserve">Deep learning with new ground truth.</w:t>
+      </w:r>
+      <w:r>
+        <w:t xml:space="preserve"> </w:t>
+      </w:r>
+      <w:r>
+        <w:t xml:space="preserve">Convolutional networks trained on Kaguya Multiband Imager</w:t>
+      </w:r>
+      <w:r>
+        <w:t xml:space="preserve"> </w:t>
+      </w:r>
+      <w:r>
+        <w:t xml:space="preserve">spectra produced global oxide maps once Chang’e-5 [10,11] and Chang’e-6</w:t>
+      </w:r>
+      <w:r>
+        <w:t xml:space="preserve"> </w:t>
+      </w:r>
+      <w:r>
+        <w:t xml:space="preserve">[12] samples were added. Comparable approaches use Diviner thermal data [13],</w:t>
+      </w:r>
+      <w:r>
+        <w:t xml:space="preserve"> </w:t>
+      </w:r>
+      <w:r>
+        <w:t xml:space="preserve">gradient boosting [14] and random forests [15].</w:t>
+      </w:r>
+      <w:r>
+        <w:t xml:space="preserve"> </w:t>
+      </w:r>
+      <w:r>
+        <w:t xml:space="preserve">-</w:t>
+      </w:r>
+      <w:r>
+        <w:t xml:space="preserve"> </w:t>
+      </w:r>
+      <w:r>
+        <w:rPr>
+          <w:i/>
+          <w:iCs/>
+        </w:rPr>
+        <w:t xml:space="preserve">The method this study builds on.</w:t>
+      </w:r>
+      <w:r>
+        <w:t xml:space="preserve"> </w:t>
+      </w:r>
+      <w:r>
+        <w:t xml:space="preserve">Fernández-Díaz et al. [16] combined a db4</w:t>
+      </w:r>
+      <w:r>
+        <w:t xml:space="preserve"> </w:t>
+      </w:r>
+      <w:r>
+        <w:t xml:space="preserve">wavelet decomposition, a deep autoencoder and a random-forest regressor to produce a global M³</w:t>
+      </w:r>
+      <w:r>
+        <w:t xml:space="preserve"> </w:t>
+      </w:r>
+      <w:r>
+        <w:t xml:space="preserve">FeO map at 150 m per pixel.</w:t>
+      </w:r>
+    </w:p>
+    <w:p>
+      <w:pPr>
+        <w:pStyle w:val="BodyText"/>
+      </w:pPr>
+      <w:r>
+        <w:t xml:space="preserve">All of these methods are trained on about 50 sampling sites. Their accuracy is reported from</w:t>
+      </w:r>
+      <w:r>
+        <w:t xml:space="preserve"> </w:t>
+      </w:r>
+      <w:r>
+        <w:t xml:space="preserve">random splits or small hold-out sets, rarely on identical data alongside competing methods, and</w:t>
+      </w:r>
+      <w:r>
+        <w:t xml:space="preserve"> </w:t>
+      </w:r>
+      <w:r>
+        <w:t xml:space="preserve">rarely against a zero-information baseline.</w:t>
+      </w:r>
+    </w:p>
+    <w:p>
+      <w:pPr>
+        <w:pStyle w:val="BodyText"/>
+      </w:pPr>
+      <w:r>
+        <w:rPr>
+          <w:b/>
+          <w:bCs/>
+        </w:rPr>
+        <w:t xml:space="preserve">Physics-based methods</w:t>
+      </w:r>
+      <w:r>
+        <w:t xml:space="preserve"> </w:t>
+      </w:r>
+      <w:r>
+        <w:t xml:space="preserve">model reflectance with radiative transfer.</w:t>
+      </w:r>
+      <w:r>
+        <w:t xml:space="preserve"> </w:t>
+      </w:r>
+      <w:r>
+        <w:t xml:space="preserve">-</w:t>
+      </w:r>
+      <w:r>
+        <w:t xml:space="preserve"> </w:t>
+      </w:r>
+      <w:r>
+        <w:rPr>
+          <w:i/>
+          <w:iCs/>
+        </w:rPr>
+        <w:t xml:space="preserve">Models.</w:t>
+      </w:r>
+      <w:r>
+        <w:t xml:space="preserve"> </w:t>
+      </w:r>
+      <w:r>
+        <w:t xml:space="preserve">The Hapke model [17] and its treatment of nanophase iron</w:t>
+      </w:r>
+      <w:r>
+        <w:t xml:space="preserve"> </w:t>
+      </w:r>
+      <w:r>
+        <w:t xml:space="preserve">[18–20] support inversions for mineral abundance, grain size and</w:t>
+      </w:r>
+      <w:r>
+        <w:t xml:space="preserve"> </w:t>
+      </w:r>
+      <w:r>
+        <w:t xml:space="preserve">submicroscopic iron [21–23].</w:t>
+      </w:r>
+      <w:r>
+        <w:t xml:space="preserve"> </w:t>
+      </w:r>
+      <w:r>
+        <w:t xml:space="preserve">-</w:t>
+      </w:r>
+      <w:r>
+        <w:t xml:space="preserve"> </w:t>
+      </w:r>
+      <w:r>
+        <w:rPr>
+          <w:i/>
+          <w:iCs/>
+        </w:rPr>
+        <w:t xml:space="preserve">Fast inversion with networks.</w:t>
+      </w:r>
+      <w:r>
+        <w:t xml:space="preserve"> </w:t>
+      </w:r>
+      <w:r>
+        <w:t xml:space="preserve">The Shkuratov model [24] was inverted on M³ with a</w:t>
+      </w:r>
+      <w:r>
+        <w:t xml:space="preserve"> </w:t>
+      </w:r>
+      <w:r>
+        <w:t xml:space="preserve">neural network trained on synthetic spectra [25].</w:t>
+      </w:r>
+      <w:r>
+        <w:t xml:space="preserve"> </w:t>
+      </w:r>
+      <w:r>
+        <w:t xml:space="preserve">-</w:t>
+      </w:r>
+      <w:r>
+        <w:t xml:space="preserve"> </w:t>
+      </w:r>
+      <w:r>
+        <w:rPr>
+          <w:i/>
+          <w:iCs/>
+        </w:rPr>
+        <w:t xml:space="preserve">Posteriors.</w:t>
+      </w:r>
+      <w:r>
+        <w:t xml:space="preserve"> </w:t>
+      </w:r>
+      <w:r>
+        <w:t xml:space="preserve">Hapke inversions have been embedded in Bayesian samplers to obtain posterior</w:t>
+      </w:r>
+      <w:r>
+        <w:t xml:space="preserve"> </w:t>
+      </w:r>
+      <w:r>
+        <w:t xml:space="preserve">abundances [26].</w:t>
+      </w:r>
+      <w:r>
+        <w:t xml:space="preserve"> </w:t>
+      </w:r>
+      <w:r>
+        <w:t xml:space="preserve">-</w:t>
+      </w:r>
+      <w:r>
+        <w:t xml:space="preserve"> </w:t>
+      </w:r>
+      <w:r>
+        <w:rPr>
+          <w:i/>
+          <w:iCs/>
+        </w:rPr>
+        <w:t xml:space="preserve">Physics-guided unmixing.</w:t>
+      </w:r>
+      <w:r>
+        <w:t xml:space="preserve"> </w:t>
+      </w:r>
+      <w:r>
+        <w:t xml:space="preserve">PGU-Net [27] placed a Hapke single-scattering-albedo mixing</w:t>
+      </w:r>
+      <w:r>
+        <w:t xml:space="preserve"> </w:t>
+      </w:r>
+      <w:r>
+        <w:t xml:space="preserve">layer inside a deep autoencoder for unsupervised unmixing. Its M³ results were validated</w:t>
+      </w:r>
+      <w:r>
+        <w:t xml:space="preserve"> </w:t>
+      </w:r>
+      <w:r>
+        <w:t xml:space="preserve">indirectly, against Kaguya products, and the authors name sample-informed priors from returned</w:t>
+      </w:r>
+      <w:r>
+        <w:t xml:space="preserve"> </w:t>
+      </w:r>
+      <w:r>
+        <w:t xml:space="preserve">materials as the next step.</w:t>
+      </w:r>
+    </w:p>
+    <w:p>
+      <w:pPr>
+        <w:pStyle w:val="BodyText"/>
+      </w:pPr>
+      <w:r>
+        <w:t xml:space="preserve">Physics inversions are interpretable but non-unique, and they are sensitive to the end-member set</w:t>
+      </w:r>
+      <w:r>
+        <w:t xml:space="preserve"> </w:t>
+      </w:r>
+      <w:r>
+        <w:t xml:space="preserve">and to the optical-constant model. Laboratory studies of the Lunar Soil Characterization</w:t>
+      </w:r>
+      <w:r>
+        <w:t xml:space="preserve"> </w:t>
+      </w:r>
+      <w:r>
+        <w:t xml:space="preserve">Consortium (LSCC) soils have also combined spectra with measured mineralogy:</w:t>
+      </w:r>
+      <w:r>
+        <w:t xml:space="preserve"> </w:t>
+      </w:r>
+      <w:r>
+        <w:t xml:space="preserve">- hybrid partial-least-squares and neural-network models [28];</w:t>
+      </w:r>
+      <w:r>
+        <w:t xml:space="preserve"> </w:t>
+      </w:r>
+      <w:r>
+        <w:t xml:space="preserve">- conversion of unmixing weights to mass fractions [29];</w:t>
+      </w:r>
+      <w:r>
+        <w:t xml:space="preserve"> </w:t>
+      </w:r>
+      <w:r>
+        <w:t xml:space="preserve">- multilayer-perceptron abundance mapping [30].</w:t>
+      </w:r>
+    </w:p>
+    <w:p>
+      <w:pPr>
+        <w:pStyle w:val="BodyText"/>
+      </w:pPr>
+      <w:r>
+        <w:rPr>
+          <w:b/>
+          <w:bCs/>
+        </w:rPr>
+        <w:t xml:space="preserve">Our reproductions of three recent methods [16,25,26]</w:t>
+      </w:r>
+      <w:r>
+        <w:t xml:space="preserve">, made</w:t>
+      </w:r>
+      <w:r>
+        <w:t xml:space="preserve"> </w:t>
+      </w:r>
+      <w:r>
+        <w:t xml:space="preserve">independently of this study, show where these approaches fall short.</w:t>
+      </w:r>
+      <w:r>
+        <w:t xml:space="preserve"> </w:t>
+      </w:r>
+      <w:r>
+        <w:t xml:space="preserve">-</w:t>
+      </w:r>
+      <w:r>
+        <w:t xml:space="preserve"> </w:t>
+      </w:r>
+      <w:r>
+        <w:rPr>
+          <w:i/>
+          <w:iCs/>
+        </w:rPr>
+        <w:t xml:space="preserve">Korokhin et al. [25].</w:t>
+      </w:r>
+      <w:r>
+        <w:t xml:space="preserve"> </w:t>
+      </w:r>
+      <w:r>
+        <w:t xml:space="preserve">On its own synthetic test set, the network recovers</w:t>
+      </w:r>
+      <w:r>
+        <w:t xml:space="preserve"> </w:t>
+      </w:r>
+      <w:r>
+        <w:t xml:space="preserve">orthopyroxene, olivine and the grey absorber with R² of only 0.06, 0.17 and 0.32. Yet these</w:t>
+      </w:r>
+      <w:r>
+        <w:t xml:space="preserve"> </w:t>
+      </w:r>
+      <w:r>
+        <w:t xml:space="preserve">quantities are mapped.</w:t>
+      </w:r>
+      <w:r>
+        <w:t xml:space="preserve"> </w:t>
+      </w:r>
+      <w:r>
+        <w:t xml:space="preserve">-</w:t>
+      </w:r>
+      <w:r>
+        <w:t xml:space="preserve"> </w:t>
+      </w:r>
+      <w:r>
+        <w:rPr>
+          <w:i/>
+          <w:iCs/>
+        </w:rPr>
+        <w:t xml:space="preserve">Jung et al. [26].</w:t>
+      </w:r>
+      <w:r>
+        <w:t xml:space="preserve"> </w:t>
+      </w:r>
+      <w:r>
+        <w:t xml:space="preserve">Abundances drawn from the prior alone, using no spectral data,</w:t>
+      </w:r>
+      <w:r>
+        <w:t xml:space="preserve"> </w:t>
+      </w:r>
+      <w:r>
+        <w:t xml:space="preserve">already meet two of the three published accuracy bounds.</w:t>
+      </w:r>
+      <w:r>
+        <w:t xml:space="preserve"> </w:t>
+      </w:r>
+      <w:r>
+        <w:t xml:space="preserve">-</w:t>
+      </w:r>
+      <w:r>
+        <w:t xml:space="preserve"> </w:t>
+      </w:r>
+      <w:r>
+        <w:rPr>
+          <w:i/>
+          <w:iCs/>
+        </w:rPr>
+        <w:t xml:space="preserve">Fernández-Díaz et al. [16].</w:t>
+      </w:r>
+      <w:r>
+        <w:t xml:space="preserve"> </w:t>
+      </w:r>
+      <w:r>
+        <w:t xml:space="preserve">The autoencoder lowers rather than raises regression</w:t>
+      </w:r>
+      <w:r>
+        <w:t xml:space="preserve"> </w:t>
+      </w:r>
+      <w:r>
+        <w:t xml:space="preserve">accuracy: a random forest on the raw wavelet coefficients is more accurate than one on the</w:t>
+      </w:r>
+      <w:r>
+        <w:t xml:space="preserve"> </w:t>
+      </w:r>
+      <w:r>
+        <w:t xml:space="preserve">autoencoder codes.</w:t>
+      </w:r>
+    </w:p>
+    <w:p>
+      <w:pPr>
+        <w:pStyle w:val="BodyText"/>
+      </w:pPr>
+      <w:r>
+        <w:t xml:space="preserve">None of these points is a criticism of the physical models themselves. Each concerns how much of</w:t>
+      </w:r>
+      <w:r>
+        <w:t xml:space="preserve"> </w:t>
+      </w:r>
+      <w:r>
+        <w:t xml:space="preserve">a retrieved number is determined by the spectrum, and how that is tested.</w:t>
+      </w:r>
+    </w:p>
+    <w:p>
+      <w:pPr>
+        <w:pStyle w:val="BodyText"/>
+      </w:pPr>
+      <w:r>
+        <w:rPr>
+          <w:b/>
+          <w:bCs/>
+        </w:rPr>
+        <w:t xml:space="preserve">What is missing</w:t>
+      </w:r>
+      <w:r>
+        <w:t xml:space="preserve"> </w:t>
+      </w:r>
+      <w:r>
+        <w:t xml:space="preserve">is a method that does four things at once:</w:t>
+      </w:r>
+      <w:r>
+        <w:t xml:space="preserve"> </w:t>
+      </w:r>
+      <w:r>
+        <w:t xml:space="preserve">- uses physics where it helps, as a source of training data;</w:t>
+      </w:r>
+      <w:r>
+        <w:t xml:space="preserve"> </w:t>
+      </w:r>
+      <w:r>
+        <w:t xml:space="preserve">- lets returned soils correct the physics;</w:t>
+      </w:r>
+      <w:r>
+        <w:t xml:space="preserve"> </w:t>
+      </w:r>
+      <w:r>
+        <w:t xml:space="preserve">- states its uncertainty and which outputs it cannot identify;</w:t>
+      </w:r>
+      <w:r>
+        <w:t xml:space="preserve"> </w:t>
+      </w:r>
+      <w:r>
+        <w:t xml:space="preserve">- is evaluated against published physics-based and deep-learning pipelines on identical data,</w:t>
+      </w:r>
+      <w:r>
+        <w:t xml:space="preserve"> </w:t>
+      </w:r>
+      <w:r>
+        <w:t xml:space="preserve">under grouped cross-validation, with a zero-information baseline.</w:t>
+      </w:r>
+    </w:p>
+    <w:p>
+      <w:pPr>
+        <w:pStyle w:val="BodyText"/>
+      </w:pPr>
+      <w:r>
+        <w:t xml:space="preserve">To address this, we propose LUMEN (LUnar Mineralogy Estimation Network). The main contributions</w:t>
+      </w:r>
+      <w:r>
+        <w:t xml:space="preserve"> </w:t>
+      </w:r>
+      <w:r>
+        <w:t xml:space="preserve">are:</w:t>
       </w:r>
     </w:p>
     <w:p>
@@ -219,730 +828,23 @@
         </w:numPr>
       </w:pPr>
       <w:r>
-        <w:t xml:space="preserve">Most of the error of physics-only inversions is removed by calibrating against returned</w:t>
-      </w:r>
-      <w:r>
-        <w:t xml:space="preserve"> </w:t>
-      </w:r>
-      <w:r>
-        <w:t xml:space="preserve">soils, not by adding model complexity.</w:t>
-      </w:r>
-    </w:p>
-    <w:p>
-      <w:pPr>
-        <w:pStyle w:val="Compact"/>
-        <w:numPr>
-          <w:ilvl w:val="0"/>
-          <w:numId w:val="1003"/>
-        </w:numPr>
-      </w:pPr>
-      <w:r>
-        <w:t xml:space="preserve">Laboratory skill does not transfer to orbital spectra without orbital labels. Fine-tuning on</w:t>
-      </w:r>
-      <w:r>
-        <w:t xml:space="preserve"> </w:t>
-      </w:r>
-      <w:r>
-        <w:t xml:space="preserve">M³ spectra at returned-sample sites halves the error but does not make the deep model the best</w:t>
-      </w:r>
-      <w:r>
-        <w:t xml:space="preserve"> </w:t>
-      </w:r>
-      <w:r>
-        <w:t xml:space="preserve">orbital FeO method: under leave-one-landing-site-out it reaches 3.27 wt% (R² = 0.34). That is</w:t>
-      </w:r>
-      <w:r>
-        <w:t xml:space="preserve"> </w:t>
-      </w:r>
-      <w:r>
-        <w:t xml:space="preserve">lower than the published wavelet–autoencoder pipeline (3.58 wt%), though not significantly,</w:t>
-      </w:r>
-      <w:r>
-        <w:t xml:space="preserve"> </w:t>
-      </w:r>
-      <w:r>
-        <w:t xml:space="preserve">and significantly higher than a linear regression on two M³ bands (2.11 wt%, R² = 0.74).</w:t>
-      </w:r>
-    </w:p>
-    <w:bookmarkEnd w:id="9"/>
-    <w:bookmarkStart w:id="10" w:name="abstract"/>
-    <w:p>
-      <w:pPr>
-        <w:pStyle w:val="Heading2"/>
-      </w:pPr>
-      <w:r>
-        <w:t xml:space="preserve">Abstract</w:t>
-      </w:r>
-    </w:p>
-    <w:p>
-      <w:pPr>
-        <w:pStyle w:val="FirstParagraph"/>
-      </w:pPr>
-      <w:r>
-        <w:t xml:space="preserve">Lunar soil composition is retrieved from reflectance spectra by empirical regressions, radiative-transfer inversions and physics-guided networks, which are rarely compared on identical data or given calibrated uncertainties. We present LUMEN, a one-dimensional convolutional network pretrained on 400,000 soils from a domain-randomised Hapke simulator with nanophase-iron space weathering, fine-tuned on laboratory spectra of the 19 Lunar Soil Characterization Consortium soils, with conformal prediction intervals and an identifiability gate that withholds outputs without demonstrable skill. Under leave-one-soil-out evaluation with a protocol fixed before scoring, LUMEN predicts FeO to 1.26 wt% and TiO₂ to 0.70 wt%, reduces the FeO error of a published wavelet–autoencoder pipeline by 42% and the mineral-proportion errors of a Shkuratov-model inversion by 54–74%, and, with its configuration chosen inside the cross-validation, is significantly more accurate than a tuned random forest on 8 of 13 targets. Intervals reach nominal coverage; olivine is not identifiable. On Moon Mineralogy Mapper spectra at 49 returned-sample sites, the laboratory model does not transfer (6.81 wt%); after orbital fine-tuning it reaches 3.27 wt% under leave-one-landing-site-out, not significantly better than the published pipeline (3.58 wt%) and significantly worse than a two-band linear regression (2.11 wt%).</w:t>
-      </w:r>
-    </w:p>
-    <w:p>
-      <w:pPr>
-        <w:pStyle w:val="BodyText"/>
-      </w:pPr>
-      <w:r>
         <w:rPr>
           <w:b/>
           <w:bCs/>
         </w:rPr>
-        <w:t xml:space="preserve">Keywords:</w:t>
-      </w:r>
-      <w:r>
-        <w:t xml:space="preserve"> </w:t>
-      </w:r>
-      <w:r>
-        <w:t xml:space="preserve">lunar regolith; FeO; mineral abundance; space weathering; Moon Mineralogy Mapper;</w:t>
-      </w:r>
-      <w:r>
-        <w:t xml:space="preserve"> </w:t>
-      </w:r>
-      <w:r>
-        <w:t xml:space="preserve">Hapke model; deep learning; transfer learning; conformal prediction; uncertainty quantification</w:t>
-      </w:r>
-    </w:p>
-    <w:bookmarkEnd w:id="10"/>
-    <w:bookmarkStart w:id="11" w:name="introduction"/>
-    <w:p>
-      <w:pPr>
-        <w:pStyle w:val="Heading2"/>
-      </w:pPr>
-      <w:r>
-        <w:t xml:space="preserve">1. Introduction</w:t>
-      </w:r>
-    </w:p>
-    <w:p>
-      <w:pPr>
-        <w:pStyle w:val="FirstParagraph"/>
-      </w:pPr>
-      <w:r>
-        <w:t xml:space="preserve">Some properties of the lunar regolith can be read remotely, and they are central to lunar science</w:t>
-      </w:r>
-      <w:r>
-        <w:t xml:space="preserve"> </w:t>
-      </w:r>
-      <w:r>
-        <w:t xml:space="preserve">and to planning in situ resource use:</w:t>
-      </w:r>
-      <w:r>
-        <w:t xml:space="preserve"> </w:t>
-      </w:r>
-      <w:r>
-        <w:t xml:space="preserve">- its iron and titanium content;</w:t>
-      </w:r>
-      <w:r>
-        <w:t xml:space="preserve"> </w:t>
-      </w:r>
-      <w:r>
-        <w:t xml:space="preserve">- its modal mineralogy;</w:t>
-      </w:r>
-      <w:r>
-        <w:t xml:space="preserve"> </w:t>
-      </w:r>
-      <w:r>
-        <w:t xml:space="preserve">- its exposure to space weathering.</w:t>
-      </w:r>
-    </w:p>
-    <w:p>
-      <w:pPr>
-        <w:pStyle w:val="BodyText"/>
-      </w:pPr>
-      <w:r>
-        <w:t xml:space="preserve">The Moon Mineralogy Mapper (M³) on Chandrayaan-1 acquired visible to near-infrared reflectance</w:t>
-      </w:r>
-      <w:r>
-        <w:t xml:space="preserve"> </w:t>
-      </w:r>
-      <w:r>
-        <w:t xml:space="preserve">spectra over most of the lunar surface [1,2]. These spectra carry the</w:t>
-      </w:r>
-      <w:r>
-        <w:t xml:space="preserve"> </w:t>
-      </w:r>
-      <w:r>
-        <w:t xml:space="preserve">crystal-field absorptions of Fe²⁺ in pyroxene and olivine near 1 and 2 µm, together with the</w:t>
-      </w:r>
-      <w:r>
-        <w:t xml:space="preserve"> </w:t>
-      </w:r>
-      <w:r>
-        <w:t xml:space="preserve">darkening and reddening produced by nanophase metallic iron. Turning such spectra into</w:t>
-      </w:r>
-      <w:r>
-        <w:t xml:space="preserve"> </w:t>
-      </w:r>
-      <w:r>
-        <w:t xml:space="preserve">quantitative composition remains an inverse problem with little ground truth.</w:t>
-      </w:r>
-    </w:p>
-    <w:p>
-      <w:pPr>
-        <w:pStyle w:val="BodyText"/>
-      </w:pPr>
-      <w:r>
-        <w:rPr>
-          <w:b/>
-          <w:bCs/>
-        </w:rPr>
-        <w:t xml:space="preserve">Empirical methods</w:t>
-      </w:r>
-      <w:r>
-        <w:t xml:space="preserve"> </w:t>
-      </w:r>
-      <w:r>
-        <w:t xml:space="preserve">relate spectral parameters to the composition of returned samples at their</w:t>
-      </w:r>
-      <w:r>
-        <w:t xml:space="preserve"> </w:t>
-      </w:r>
-      <w:r>
-        <w:t xml:space="preserve">landing sites.</w:t>
-      </w:r>
-      <w:r>
-        <w:t xml:space="preserve"> </w:t>
-      </w:r>
-      <w:r>
-        <w:t xml:space="preserve">-</w:t>
-      </w:r>
-      <w:r>
-        <w:t xml:space="preserve"> </w:t>
-      </w:r>
-      <w:r>
-        <w:rPr>
-          <w:i/>
-          <w:iCs/>
-        </w:rPr>
-        <w:t xml:space="preserve">Band ratios and band parameters.</w:t>
-      </w:r>
-      <w:r>
-        <w:t xml:space="preserve"> </w:t>
-      </w:r>
-      <w:r>
-        <w:t xml:space="preserve">The Clementine band-ratio algorithms of Lucey et al.</w:t>
-      </w:r>
-      <w:r>
-        <w:t xml:space="preserve"> </w:t>
-      </w:r>
-      <w:r>
-        <w:t xml:space="preserve">[3] remain the reference for FeO and TiO₂. Band-depth and band-centre parameters of</w:t>
-      </w:r>
-      <w:r>
-        <w:t xml:space="preserve"> </w:t>
-      </w:r>
-      <w:r>
-        <w:t xml:space="preserve">the 1 and 2 µm absorptions have been calibrated for M³ [4,5].</w:t>
-      </w:r>
-      <w:r>
-        <w:t xml:space="preserve"> </w:t>
-      </w:r>
-      <w:r>
-        <w:t xml:space="preserve">-</w:t>
-      </w:r>
-      <w:r>
-        <w:t xml:space="preserve"> </w:t>
-      </w:r>
-      <w:r>
-        <w:rPr>
-          <w:i/>
-          <w:iCs/>
-        </w:rPr>
-        <w:t xml:space="preserve">Regression and machine learning.</w:t>
-      </w:r>
-      <w:r>
-        <w:t xml:space="preserve"> </w:t>
-      </w:r>
-      <w:r>
-        <w:t xml:space="preserve">Methods range from partial least squares [6] and</w:t>
-      </w:r>
-      <w:r>
-        <w:t xml:space="preserve"> </w:t>
-      </w:r>
-      <w:r>
-        <w:t xml:space="preserve">neural networks [7] to support vector machines [8] and systematic comparisons of</w:t>
-      </w:r>
-      <w:r>
-        <w:t xml:space="preserve"> </w:t>
-      </w:r>
-      <w:r>
-        <w:t xml:space="preserve">regressors [9].</w:t>
-      </w:r>
-      <w:r>
-        <w:t xml:space="preserve"> </w:t>
-      </w:r>
-      <w:r>
-        <w:t xml:space="preserve">-</w:t>
-      </w:r>
-      <w:r>
-        <w:t xml:space="preserve"> </w:t>
-      </w:r>
-      <w:r>
-        <w:rPr>
-          <w:i/>
-          <w:iCs/>
-        </w:rPr>
-        <w:t xml:space="preserve">Deep learning with new ground truth.</w:t>
-      </w:r>
-      <w:r>
-        <w:t xml:space="preserve"> </w:t>
-      </w:r>
-      <w:r>
-        <w:t xml:space="preserve">Convolutional networks trained on Kaguya Multiband Imager</w:t>
-      </w:r>
-      <w:r>
-        <w:t xml:space="preserve"> </w:t>
-      </w:r>
-      <w:r>
-        <w:t xml:space="preserve">spectra produced global oxide maps once Chang’e-5 [10,11] and Chang’e-6</w:t>
-      </w:r>
-      <w:r>
-        <w:t xml:space="preserve"> </w:t>
-      </w:r>
-      <w:r>
-        <w:t xml:space="preserve">[12] samples were added. Comparable approaches use Diviner thermal data [13],</w:t>
-      </w:r>
-      <w:r>
-        <w:t xml:space="preserve"> </w:t>
-      </w:r>
-      <w:r>
-        <w:t xml:space="preserve">gradient boosting [14] and random forests [15].</w:t>
-      </w:r>
-      <w:r>
-        <w:t xml:space="preserve"> </w:t>
-      </w:r>
-      <w:r>
-        <w:t xml:space="preserve">-</w:t>
-      </w:r>
-      <w:r>
-        <w:t xml:space="preserve"> </w:t>
-      </w:r>
-      <w:r>
-        <w:rPr>
-          <w:i/>
-          <w:iCs/>
-        </w:rPr>
-        <w:t xml:space="preserve">The method this study builds on.</w:t>
-      </w:r>
-      <w:r>
-        <w:t xml:space="preserve"> </w:t>
-      </w:r>
-      <w:r>
-        <w:t xml:space="preserve">Fernández-Díaz et al. [16] combined a db4</w:t>
-      </w:r>
-      <w:r>
-        <w:t xml:space="preserve"> </w:t>
-      </w:r>
-      <w:r>
-        <w:t xml:space="preserve">wavelet decomposition, a deep autoencoder and a random-forest regressor to produce a global M³</w:t>
-      </w:r>
-      <w:r>
-        <w:t xml:space="preserve"> </w:t>
-      </w:r>
-      <w:r>
-        <w:t xml:space="preserve">FeO map at 150 m per pixel.</w:t>
-      </w:r>
-    </w:p>
-    <w:p>
-      <w:pPr>
-        <w:pStyle w:val="BodyText"/>
-      </w:pPr>
-      <w:r>
-        <w:t xml:space="preserve">All of these methods are trained on about 50 sampling sites. Their accuracy is reported from</w:t>
-      </w:r>
-      <w:r>
-        <w:t xml:space="preserve"> </w:t>
-      </w:r>
-      <w:r>
-        <w:t xml:space="preserve">random splits or small hold-out sets, rarely on identical data alongside competing methods, and</w:t>
-      </w:r>
-      <w:r>
-        <w:t xml:space="preserve"> </w:t>
-      </w:r>
-      <w:r>
-        <w:t xml:space="preserve">rarely against a zero-information baseline.</w:t>
-      </w:r>
-    </w:p>
-    <w:p>
-      <w:pPr>
-        <w:pStyle w:val="BodyText"/>
-      </w:pPr>
-      <w:r>
-        <w:rPr>
-          <w:b/>
-          <w:bCs/>
-        </w:rPr>
-        <w:t xml:space="preserve">Physics-based methods</w:t>
-      </w:r>
-      <w:r>
-        <w:t xml:space="preserve"> </w:t>
-      </w:r>
-      <w:r>
-        <w:t xml:space="preserve">model reflectance with radiative transfer.</w:t>
-      </w:r>
-      <w:r>
-        <w:t xml:space="preserve"> </w:t>
-      </w:r>
-      <w:r>
-        <w:t xml:space="preserve">-</w:t>
-      </w:r>
-      <w:r>
-        <w:t xml:space="preserve"> </w:t>
-      </w:r>
-      <w:r>
-        <w:rPr>
-          <w:i/>
-          <w:iCs/>
-        </w:rPr>
-        <w:t xml:space="preserve">Models.</w:t>
-      </w:r>
-      <w:r>
-        <w:t xml:space="preserve"> </w:t>
-      </w:r>
-      <w:r>
-        <w:t xml:space="preserve">The Hapke model [17] and its treatment of nanophase iron</w:t>
-      </w:r>
-      <w:r>
-        <w:t xml:space="preserve"> </w:t>
-      </w:r>
-      <w:r>
-        <w:t xml:space="preserve">[18–20] support inversions for mineral abundance, grain size and</w:t>
-      </w:r>
-      <w:r>
-        <w:t xml:space="preserve"> </w:t>
-      </w:r>
-      <w:r>
-        <w:t xml:space="preserve">submicroscopic iron [21–23].</w:t>
-      </w:r>
-      <w:r>
-        <w:t xml:space="preserve"> </w:t>
-      </w:r>
-      <w:r>
-        <w:t xml:space="preserve">-</w:t>
-      </w:r>
-      <w:r>
-        <w:t xml:space="preserve"> </w:t>
-      </w:r>
-      <w:r>
-        <w:rPr>
-          <w:i/>
-          <w:iCs/>
-        </w:rPr>
-        <w:t xml:space="preserve">Fast inversion with networks.</w:t>
-      </w:r>
-      <w:r>
-        <w:t xml:space="preserve"> </w:t>
-      </w:r>
-      <w:r>
-        <w:t xml:space="preserve">The Shkuratov model [24] was inverted on M³ with a</w:t>
-      </w:r>
-      <w:r>
-        <w:t xml:space="preserve"> </w:t>
-      </w:r>
-      <w:r>
-        <w:t xml:space="preserve">neural network trained on synthetic spectra [25].</w:t>
-      </w:r>
-      <w:r>
-        <w:t xml:space="preserve"> </w:t>
-      </w:r>
-      <w:r>
-        <w:t xml:space="preserve">-</w:t>
-      </w:r>
-      <w:r>
-        <w:t xml:space="preserve"> </w:t>
-      </w:r>
-      <w:r>
-        <w:rPr>
-          <w:i/>
-          <w:iCs/>
-        </w:rPr>
-        <w:t xml:space="preserve">Posteriors.</w:t>
-      </w:r>
-      <w:r>
-        <w:t xml:space="preserve"> </w:t>
-      </w:r>
-      <w:r>
-        <w:t xml:space="preserve">Hapke inversions have been embedded in Bayesian samplers to obtain posterior</w:t>
-      </w:r>
-      <w:r>
-        <w:t xml:space="preserve"> </w:t>
-      </w:r>
-      <w:r>
-        <w:t xml:space="preserve">abundances [26].</w:t>
-      </w:r>
-      <w:r>
-        <w:t xml:space="preserve"> </w:t>
-      </w:r>
-      <w:r>
-        <w:t xml:space="preserve">-</w:t>
-      </w:r>
-      <w:r>
-        <w:t xml:space="preserve"> </w:t>
-      </w:r>
-      <w:r>
-        <w:rPr>
-          <w:i/>
-          <w:iCs/>
-        </w:rPr>
-        <w:t xml:space="preserve">Physics-guided unmixing.</w:t>
-      </w:r>
-      <w:r>
-        <w:t xml:space="preserve"> </w:t>
-      </w:r>
-      <w:r>
-        <w:t xml:space="preserve">PGU-Net [27] placed a Hapke single-scattering-albedo mixing</w:t>
-      </w:r>
-      <w:r>
-        <w:t xml:space="preserve"> </w:t>
-      </w:r>
-      <w:r>
-        <w:t xml:space="preserve">layer inside a deep autoencoder for unsupervised unmixing. Its M³ results were validated</w:t>
-      </w:r>
-      <w:r>
-        <w:t xml:space="preserve"> </w:t>
-      </w:r>
-      <w:r>
-        <w:t xml:space="preserve">indirectly, against Kaguya products, and the authors name sample-informed priors from returned</w:t>
-      </w:r>
-      <w:r>
-        <w:t xml:space="preserve"> </w:t>
-      </w:r>
-      <w:r>
-        <w:t xml:space="preserve">materials as the next step.</w:t>
-      </w:r>
-    </w:p>
-    <w:p>
-      <w:pPr>
-        <w:pStyle w:val="BodyText"/>
-      </w:pPr>
-      <w:r>
-        <w:t xml:space="preserve">Physics inversions are interpretable but non-unique, and they are sensitive to the end-member set</w:t>
-      </w:r>
-      <w:r>
-        <w:t xml:space="preserve"> </w:t>
-      </w:r>
-      <w:r>
-        <w:t xml:space="preserve">and to the optical-constant model. Laboratory studies of the Lunar Soil Characterization</w:t>
-      </w:r>
-      <w:r>
-        <w:t xml:space="preserve"> </w:t>
-      </w:r>
-      <w:r>
-        <w:t xml:space="preserve">Consortium (LSCC) soils have also combined spectra with measured mineralogy:</w:t>
-      </w:r>
-      <w:r>
-        <w:t xml:space="preserve"> </w:t>
-      </w:r>
-      <w:r>
-        <w:t xml:space="preserve">- hybrid partial-least-squares and neural-network models [28];</w:t>
-      </w:r>
-      <w:r>
-        <w:t xml:space="preserve"> </w:t>
-      </w:r>
-      <w:r>
-        <w:t xml:space="preserve">- conversion of unmixing weights to mass fractions [29];</w:t>
-      </w:r>
-      <w:r>
-        <w:t xml:space="preserve"> </w:t>
-      </w:r>
-      <w:r>
-        <w:t xml:space="preserve">- multilayer-perceptron abundance mapping [30].</w:t>
-      </w:r>
-    </w:p>
-    <w:p>
-      <w:pPr>
-        <w:pStyle w:val="BodyText"/>
-      </w:pPr>
-      <w:r>
-        <w:rPr>
-          <w:b/>
-          <w:bCs/>
-        </w:rPr>
-        <w:t xml:space="preserve">Our reproductions of three recent methods [16,25,26]</w:t>
-      </w:r>
-      <w:r>
-        <w:t xml:space="preserve">, made</w:t>
-      </w:r>
-      <w:r>
-        <w:t xml:space="preserve"> </w:t>
-      </w:r>
-      <w:r>
-        <w:t xml:space="preserve">independently of this study, show where these approaches fall short.</w:t>
-      </w:r>
-      <w:r>
-        <w:t xml:space="preserve"> </w:t>
-      </w:r>
-      <w:r>
-        <w:t xml:space="preserve">-</w:t>
-      </w:r>
-      <w:r>
-        <w:t xml:space="preserve"> </w:t>
-      </w:r>
-      <w:r>
-        <w:rPr>
-          <w:i/>
-          <w:iCs/>
-        </w:rPr>
-        <w:t xml:space="preserve">Korokhin et al. [25].</w:t>
-      </w:r>
-      <w:r>
-        <w:t xml:space="preserve"> </w:t>
-      </w:r>
-      <w:r>
-        <w:t xml:space="preserve">On its own synthetic test set, the network recovers</w:t>
-      </w:r>
-      <w:r>
-        <w:t xml:space="preserve"> </w:t>
-      </w:r>
-      <w:r>
-        <w:t xml:space="preserve">orthopyroxene, olivine and the grey absorber with R² of only 0.06, 0.17 and 0.32. Yet these</w:t>
-      </w:r>
-      <w:r>
-        <w:t xml:space="preserve"> </w:t>
-      </w:r>
-      <w:r>
-        <w:t xml:space="preserve">quantities are mapped.</w:t>
-      </w:r>
-      <w:r>
-        <w:t xml:space="preserve"> </w:t>
-      </w:r>
-      <w:r>
-        <w:t xml:space="preserve">-</w:t>
-      </w:r>
-      <w:r>
-        <w:t xml:space="preserve"> </w:t>
-      </w:r>
-      <w:r>
-        <w:rPr>
-          <w:i/>
-          <w:iCs/>
-        </w:rPr>
-        <w:t xml:space="preserve">Jung et al. [26].</w:t>
-      </w:r>
-      <w:r>
-        <w:t xml:space="preserve"> </w:t>
-      </w:r>
-      <w:r>
-        <w:t xml:space="preserve">Abundances drawn from the prior alone, using no spectral data,</w:t>
-      </w:r>
-      <w:r>
-        <w:t xml:space="preserve"> </w:t>
-      </w:r>
-      <w:r>
-        <w:t xml:space="preserve">already meet two of the three published accuracy bounds.</w:t>
-      </w:r>
-      <w:r>
-        <w:t xml:space="preserve"> </w:t>
-      </w:r>
-      <w:r>
-        <w:t xml:space="preserve">-</w:t>
-      </w:r>
-      <w:r>
-        <w:t xml:space="preserve"> </w:t>
-      </w:r>
-      <w:r>
-        <w:rPr>
-          <w:i/>
-          <w:iCs/>
-        </w:rPr>
-        <w:t xml:space="preserve">Fernández-Díaz et al. [16].</w:t>
-      </w:r>
-      <w:r>
-        <w:t xml:space="preserve"> </w:t>
-      </w:r>
-      <w:r>
-        <w:t xml:space="preserve">The autoencoder lowers rather than raises regression</w:t>
-      </w:r>
-      <w:r>
-        <w:t xml:space="preserve"> </w:t>
-      </w:r>
-      <w:r>
-        <w:t xml:space="preserve">accuracy: a random forest on the raw wavelet coefficients is more accurate than one on the</w:t>
-      </w:r>
-      <w:r>
-        <w:t xml:space="preserve"> </w:t>
-      </w:r>
-      <w:r>
-        <w:t xml:space="preserve">autoencoder codes.</w:t>
-      </w:r>
-    </w:p>
-    <w:p>
-      <w:pPr>
-        <w:pStyle w:val="BodyText"/>
-      </w:pPr>
-      <w:r>
-        <w:t xml:space="preserve">None of these points is a criticism of the physical models themselves. Each concerns how much of</w:t>
-      </w:r>
-      <w:r>
-        <w:t xml:space="preserve"> </w:t>
-      </w:r>
-      <w:r>
-        <w:t xml:space="preserve">a retrieved number is determined by the spectrum, and how that is tested.</w:t>
-      </w:r>
-    </w:p>
-    <w:p>
-      <w:pPr>
-        <w:pStyle w:val="BodyText"/>
-      </w:pPr>
-      <w:r>
-        <w:rPr>
-          <w:b/>
-          <w:bCs/>
-        </w:rPr>
-        <w:t xml:space="preserve">What is missing</w:t>
-      </w:r>
-      <w:r>
-        <w:t xml:space="preserve"> </w:t>
-      </w:r>
-      <w:r>
-        <w:t xml:space="preserve">is a method that does four things at once:</w:t>
-      </w:r>
-      <w:r>
-        <w:t xml:space="preserve"> </w:t>
-      </w:r>
-      <w:r>
-        <w:t xml:space="preserve">- uses physics where it helps, as a source of training data;</w:t>
-      </w:r>
-      <w:r>
-        <w:t xml:space="preserve"> </w:t>
-      </w:r>
-      <w:r>
-        <w:t xml:space="preserve">- lets returned soils correct the physics;</w:t>
-      </w:r>
-      <w:r>
-        <w:t xml:space="preserve"> </w:t>
-      </w:r>
-      <w:r>
-        <w:t xml:space="preserve">- states its uncertainty and which outputs it cannot identify;</w:t>
-      </w:r>
-      <w:r>
-        <w:t xml:space="preserve"> </w:t>
-      </w:r>
-      <w:r>
-        <w:t xml:space="preserve">- is evaluated against published physics-based and deep-learning pipelines on identical data,</w:t>
-      </w:r>
-      <w:r>
-        <w:t xml:space="preserve"> </w:t>
-      </w:r>
-      <w:r>
-        <w:t xml:space="preserve">under grouped cross-validation, with a zero-information baseline.</w:t>
-      </w:r>
-    </w:p>
-    <w:p>
-      <w:pPr>
-        <w:pStyle w:val="BodyText"/>
-      </w:pPr>
-      <w:r>
-        <w:t xml:space="preserve">To address this, we propose LUMEN (LUnar Mineralogy Estimation Network). The main contributions</w:t>
-      </w:r>
-      <w:r>
-        <w:t xml:space="preserve"> </w:t>
-      </w:r>
-      <w:r>
-        <w:t xml:space="preserve">are:</w:t>
+        <w:t xml:space="preserve">A hybrid method, LUMEN.</w:t>
+      </w:r>
+      <w:r>
+        <w:t xml:space="preserve"> </w:t>
+      </w:r>
+      <w:r>
+        <w:t xml:space="preserve">It joins physics simulation and supervised learning for lunar</w:t>
+      </w:r>
+      <w:r>
+        <w:t xml:space="preserve"> </w:t>
+      </w:r>
+      <w:r>
+        <w:t xml:space="preserve">soil composition.</w:t>
       </w:r>
     </w:p>
     <w:p>
@@ -954,23 +856,73 @@
         </w:numPr>
       </w:pPr>
       <w:r>
-        <w:rPr>
-          <w:b/>
-          <w:bCs/>
-        </w:rPr>
-        <w:t xml:space="preserve">A hybrid method, LUMEN.</w:t>
-      </w:r>
-      <w:r>
-        <w:t xml:space="preserve"> </w:t>
-      </w:r>
-      <w:r>
-        <w:t xml:space="preserve">It joins physics simulation and supervised learning for lunar</w:t>
-      </w:r>
-      <w:r>
-        <w:t xml:space="preserve"> </w:t>
-      </w:r>
-      <w:r>
-        <w:t xml:space="preserve">soil composition.</w:t>
+        <w:t xml:space="preserve">A domain-randomised Hapke simulator generates 400,000 synthetic soils. It uses 49 lunar mineral</w:t>
+      </w:r>
+      <w:r>
+        <w:t xml:space="preserve"> </w:t>
+      </w:r>
+      <w:r>
+        <w:t xml:space="preserve">and glass end-members (none taken from an evaluation soil) and physically modelled nanophase-</w:t>
+      </w:r>
+      <w:r>
+        <w:t xml:space="preserve"> </w:t>
+      </w:r>
+      <w:r>
+        <w:t xml:space="preserve">and microphase-iron weathering.</w:t>
+      </w:r>
+    </w:p>
+    <w:p>
+      <w:pPr>
+        <w:pStyle w:val="Compact"/>
+        <w:numPr>
+          <w:ilvl w:val="0"/>
+          <w:numId w:val="1004"/>
+        </w:numPr>
+      </w:pPr>
+      <w:r>
+        <w:t xml:space="preserve">A compact one-dimensional convolutional network is pretrained on them and fine-tuned on</w:t>
+      </w:r>
+      <w:r>
+        <w:t xml:space="preserve"> </w:t>
+      </w:r>
+      <w:r>
+        <w:t xml:space="preserve">returned soils.</w:t>
+      </w:r>
+    </w:p>
+    <w:p>
+      <w:pPr>
+        <w:pStyle w:val="Compact"/>
+        <w:numPr>
+          <w:ilvl w:val="0"/>
+          <w:numId w:val="1004"/>
+        </w:numPr>
+      </w:pPr>
+      <w:r>
+        <w:t xml:space="preserve">From one spectrum the network predicts seven-part modal mineralogy, five oxides and maturity.</w:t>
+      </w:r>
+    </w:p>
+    <w:p>
+      <w:pPr>
+        <w:pStyle w:val="Compact"/>
+        <w:numPr>
+          <w:ilvl w:val="0"/>
+          <w:numId w:val="1004"/>
+        </w:numPr>
+      </w:pPr>
+      <w:r>
+        <w:t xml:space="preserve">A deep ensemble with conformal calibration supplies intervals with verified coverage. An</w:t>
+      </w:r>
+      <w:r>
+        <w:t xml:space="preserve"> </w:t>
+      </w:r>
+      <w:r>
+        <w:t xml:space="preserve">identifiability gate withholds every target whose skill over a zero-information baseline is not</w:t>
+      </w:r>
+      <w:r>
+        <w:t xml:space="preserve"> </w:t>
+      </w:r>
+      <w:r>
+        <w:t xml:space="preserve">demonstrable.</w:t>
       </w:r>
     </w:p>
     <w:p>
@@ -982,73 +934,29 @@
         </w:numPr>
       </w:pPr>
       <w:r>
-        <w:t xml:space="preserve">A domain-randomised Hapke simulator generates 400,000 synthetic soils. It uses 49 lunar mineral</w:t>
-      </w:r>
-      <w:r>
-        <w:t xml:space="preserve"> </w:t>
-      </w:r>
-      <w:r>
-        <w:t xml:space="preserve">and glass end-members (none taken from an evaluation soil) and physically modelled nanophase-</w:t>
-      </w:r>
-      <w:r>
-        <w:t xml:space="preserve"> </w:t>
-      </w:r>
-      <w:r>
-        <w:t xml:space="preserve">and microphase-iron weathering.</w:t>
-      </w:r>
-    </w:p>
-    <w:p>
-      <w:pPr>
-        <w:pStyle w:val="Compact"/>
-        <w:numPr>
-          <w:ilvl w:val="0"/>
-          <w:numId w:val="1005"/>
-        </w:numPr>
-      </w:pPr>
-      <w:r>
-        <w:t xml:space="preserve">A compact one-dimensional convolutional network is pretrained on them and fine-tuned on</w:t>
-      </w:r>
-      <w:r>
-        <w:t xml:space="preserve"> </w:t>
-      </w:r>
-      <w:r>
-        <w:t xml:space="preserve">returned soils.</w:t>
-      </w:r>
-    </w:p>
-    <w:p>
-      <w:pPr>
-        <w:pStyle w:val="Compact"/>
-        <w:numPr>
-          <w:ilvl w:val="0"/>
-          <w:numId w:val="1005"/>
-        </w:numPr>
-      </w:pPr>
-      <w:r>
-        <w:t xml:space="preserve">From one spectrum the network predicts seven-part modal mineralogy, five oxides and maturity.</w:t>
-      </w:r>
-    </w:p>
-    <w:p>
-      <w:pPr>
-        <w:pStyle w:val="Compact"/>
-        <w:numPr>
-          <w:ilvl w:val="0"/>
-          <w:numId w:val="1005"/>
-        </w:numPr>
-      </w:pPr>
-      <w:r>
-        <w:t xml:space="preserve">A deep ensemble with conformal calibration supplies intervals with verified coverage. An</w:t>
-      </w:r>
-      <w:r>
-        <w:t xml:space="preserve"> </w:t>
-      </w:r>
-      <w:r>
-        <w:t xml:space="preserve">identifiability gate withholds every target whose skill over a zero-information baseline is not</w:t>
-      </w:r>
-      <w:r>
-        <w:t xml:space="preserve"> </w:t>
-      </w:r>
-      <w:r>
-        <w:t xml:space="preserve">demonstrable.</w:t>
+        <w:rPr>
+          <w:b/>
+          <w:bCs/>
+        </w:rPr>
+        <w:t xml:space="preserve">An identical-data, protocol-fixed comparison.</w:t>
+      </w:r>
+      <w:r>
+        <w:t xml:space="preserve"> </w:t>
+      </w:r>
+      <w:r>
+        <w:t xml:space="preserve">LUMEN is compared with three published</w:t>
+      </w:r>
+      <w:r>
+        <w:t xml:space="preserve"> </w:t>
+      </w:r>
+      <w:r>
+        <w:t xml:space="preserve">methods (wavelet–autoencoder regression [16], Shkuratov-model inversion</w:t>
+      </w:r>
+      <w:r>
+        <w:t xml:space="preserve"> </w:t>
+      </w:r>
+      <w:r>
+        <w:t xml:space="preserve">[25] and Hapke–Bayesian inversion [26]) and with classical regressors.</w:t>
       </w:r>
     </w:p>
     <w:p>
@@ -1060,29 +968,43 @@
         </w:numPr>
       </w:pPr>
       <w:r>
-        <w:rPr>
-          <w:b/>
-          <w:bCs/>
-        </w:rPr>
-        <w:t xml:space="preserve">An identical-data, protocol-fixed comparison.</w:t>
-      </w:r>
-      <w:r>
-        <w:t xml:space="preserve"> </w:t>
-      </w:r>
-      <w:r>
-        <w:t xml:space="preserve">LUMEN is compared with three published</w:t>
-      </w:r>
-      <w:r>
-        <w:t xml:space="preserve"> </w:t>
-      </w:r>
-      <w:r>
-        <w:t xml:space="preserve">methods (wavelet–autoencoder regression [16], Shkuratov-model inversion</w:t>
-      </w:r>
-      <w:r>
-        <w:t xml:space="preserve"> </w:t>
-      </w:r>
-      <w:r>
-        <w:t xml:space="preserve">[25] and Hapke–Bayesian inversion [26]) and with classical regressors.</w:t>
+        <w:t xml:space="preserve">All methods use the same 75 laboratory spectra and the same leave-one-soil-out and</w:t>
+      </w:r>
+      <w:r>
+        <w:t xml:space="preserve"> </w:t>
+      </w:r>
+      <w:r>
+        <w:t xml:space="preserve">leave-one-mission-out folds.</w:t>
+      </w:r>
+    </w:p>
+    <w:p>
+      <w:pPr>
+        <w:pStyle w:val="Compact"/>
+        <w:numPr>
+          <w:ilvl w:val="0"/>
+          <w:numId w:val="1006"/>
+        </w:numPr>
+      </w:pPr>
+      <w:r>
+        <w:t xml:space="preserve">The tests are paired and corrected for multiple comparisons.</w:t>
+      </w:r>
+    </w:p>
+    <w:p>
+      <w:pPr>
+        <w:pStyle w:val="Compact"/>
+        <w:numPr>
+          <w:ilvl w:val="0"/>
+          <w:numId w:val="1006"/>
+        </w:numPr>
+      </w:pPr>
+      <w:r>
+        <w:t xml:space="preserve">Every evaluation choice was committed to version control before the first score was computed.</w:t>
+      </w:r>
+      <w:r>
+        <w:t xml:space="preserve"> </w:t>
+      </w:r>
+      <w:r>
+        <w:t xml:space="preserve">Negative and null results are reported alongside the positive ones.</w:t>
       </w:r>
     </w:p>
     <w:p>
@@ -1094,43 +1016,23 @@
         </w:numPr>
       </w:pPr>
       <w:r>
-        <w:t xml:space="preserve">All methods use the same 75 laboratory spectra and the same leave-one-soil-out and</w:t>
-      </w:r>
-      <w:r>
-        <w:t xml:space="preserve"> </w:t>
-      </w:r>
-      <w:r>
-        <w:t xml:space="preserve">leave-one-mission-out folds.</w:t>
-      </w:r>
-    </w:p>
-    <w:p>
-      <w:pPr>
-        <w:pStyle w:val="Compact"/>
-        <w:numPr>
-          <w:ilvl w:val="0"/>
-          <w:numId w:val="1007"/>
-        </w:numPr>
-      </w:pPr>
-      <w:r>
-        <w:t xml:space="preserve">The tests are paired and corrected for multiple comparisons.</w:t>
-      </w:r>
-    </w:p>
-    <w:p>
-      <w:pPr>
-        <w:pStyle w:val="Compact"/>
-        <w:numPr>
-          <w:ilvl w:val="0"/>
-          <w:numId w:val="1007"/>
-        </w:numPr>
-      </w:pPr>
-      <w:r>
-        <w:t xml:space="preserve">Every evaluation choice was committed to version control before the first score was computed.</w:t>
-      </w:r>
-      <w:r>
-        <w:t xml:space="preserve"> </w:t>
-      </w:r>
-      <w:r>
-        <w:t xml:space="preserve">Negative and null results are reported alongside the positive ones.</w:t>
+        <w:rPr>
+          <w:b/>
+          <w:bCs/>
+        </w:rPr>
+        <w:t xml:space="preserve">A test of laboratory-to-orbit transfer.</w:t>
+      </w:r>
+      <w:r>
+        <w:t xml:space="preserve"> </w:t>
+      </w:r>
+      <w:r>
+        <w:t xml:space="preserve">It uses M³ spectra at the returned-sample sites</w:t>
+      </w:r>
+      <w:r>
+        <w:t xml:space="preserve"> </w:t>
+      </w:r>
+      <w:r>
+        <w:t xml:space="preserve">on which the base method was calibrated [16,31].</w:t>
       </w:r>
     </w:p>
     <w:p>
@@ -1142,23 +1044,13 @@
         </w:numPr>
       </w:pPr>
       <w:r>
-        <w:rPr>
-          <w:b/>
-          <w:bCs/>
-        </w:rPr>
-        <w:t xml:space="preserve">A test of laboratory-to-orbit transfer.</w:t>
-      </w:r>
-      <w:r>
-        <w:t xml:space="preserve"> </w:t>
-      </w:r>
-      <w:r>
-        <w:t xml:space="preserve">It uses M³ spectra at the returned-sample sites</w:t>
-      </w:r>
-      <w:r>
-        <w:t xml:space="preserve"> </w:t>
-      </w:r>
-      <w:r>
-        <w:t xml:space="preserve">on which the base method was calibrated [16,31].</w:t>
+        <w:t xml:space="preserve">It uses both that method’s own cross-validation and a spatially honest leave-one-landing-site-out</w:t>
+      </w:r>
+      <w:r>
+        <w:t xml:space="preserve"> </w:t>
+      </w:r>
+      <w:r>
+        <w:t xml:space="preserve">protocol.</w:t>
       </w:r>
     </w:p>
     <w:p>
@@ -1166,28 +1058,10 @@
         <w:pStyle w:val="Compact"/>
         <w:numPr>
           <w:ilvl w:val="0"/>
-          <w:numId w:val="1009"/>
+          <w:numId w:val="1008"/>
         </w:numPr>
       </w:pPr>
       <w:r>
-        <w:t xml:space="preserve">It uses both that method’s own cross-validation and a spatially honest leave-one-landing-site-out</w:t>
-      </w:r>
-      <w:r>
-        <w:t xml:space="preserve"> </w:t>
-      </w:r>
-      <w:r>
-        <w:t xml:space="preserve">protocol.</w:t>
-      </w:r>
-    </w:p>
-    <w:p>
-      <w:pPr>
-        <w:pStyle w:val="Compact"/>
-        <w:numPr>
-          <w:ilvl w:val="0"/>
-          <w:numId w:val="1009"/>
-        </w:numPr>
-      </w:pPr>
-      <w:r>
         <w:t xml:space="preserve">It shows that laboratory accuracy does not carry over to orbit without orbital labels, how</w:t>
       </w:r>
       <w:r>
@@ -1236,7 +1110,7 @@
       </w:r>
     </w:p>
     <w:bookmarkEnd w:id="11"/>
-    <w:bookmarkStart w:id="31" w:name="materials-and-methods"/>
+    <w:bookmarkStart w:id="32" w:name="materials-and-methods"/>
     <w:p>
       <w:pPr>
         <w:pStyle w:val="Heading2"/>
@@ -6578,8 +6452,26 @@
     </w:p>
     <w:bookmarkEnd w:id="29"/>
     <w:bookmarkEnd w:id="30"/>
+    <w:bookmarkStart w:id="31" w:name="X662c2d66dd1eda3268d2087202c966cd73b2601"/>
+    <w:p>
+      <w:pPr>
+        <w:pStyle w:val="Heading3"/>
+      </w:pPr>
+      <w:r>
+        <w:t xml:space="preserve">2.4. Use of Generative Artificial Intelligence</w:t>
+      </w:r>
+    </w:p>
+    <w:p>
+      <w:pPr>
+        <w:pStyle w:val="FirstParagraph"/>
+      </w:pPr>
+      <w:r>
+        <w:t xml:space="preserve">Parts of the analysis code and of the manuscript text were drafted with the assistance of a generative AI system (Anthropic Claude). The AI system was not used to generate data. Every reported number was produced by the released code from the staged input data, and the evaluation protocol was fixed in version control before scoring. The authors reviewed the code, the analysis and the text, and take full responsibility for the content.</w:t>
+      </w:r>
+    </w:p>
     <w:bookmarkEnd w:id="31"/>
-    <w:bookmarkStart w:id="61" w:name="results"/>
+    <w:bookmarkEnd w:id="32"/>
+    <w:bookmarkStart w:id="62" w:name="results"/>
     <w:p>
       <w:pPr>
         <w:pStyle w:val="Heading2"/>
@@ -6588,7 +6480,7 @@
         <w:t xml:space="preserve">3. Results</w:t>
       </w:r>
     </w:p>
-    <w:bookmarkStart w:id="35" w:name="experimental-setup"/>
+    <w:bookmarkStart w:id="36" w:name="experimental-setup"/>
     <w:p>
       <w:pPr>
         <w:pStyle w:val="Heading3"/>
@@ -6597,7 +6489,7 @@
         <w:t xml:space="preserve">3.1. Experimental Setup</w:t>
       </w:r>
     </w:p>
-    <w:bookmarkStart w:id="32" w:name="comparison-algorithms"/>
+    <w:bookmarkStart w:id="33" w:name="comparison-algorithms"/>
     <w:p>
       <w:pPr>
         <w:pStyle w:val="Heading4"/>
@@ -6932,8 +6824,8 @@
         <w:t xml:space="preserve">- The training-fold mean.</w:t>
       </w:r>
     </w:p>
-    <w:bookmarkEnd w:id="32"/>
-    <w:bookmarkStart w:id="33" w:name="parameter-settings"/>
+    <w:bookmarkEnd w:id="33"/>
+    <w:bookmarkStart w:id="34" w:name="parameter-settings"/>
     <w:p>
       <w:pPr>
         <w:pStyle w:val="Heading4"/>
@@ -7259,8 +7151,8 @@
         </w:tc>
       </w:tr>
     </w:tbl>
-    <w:bookmarkEnd w:id="33"/>
-    <w:bookmarkStart w:id="34" w:name="evaluation-protocols-and-metrics"/>
+    <w:bookmarkEnd w:id="34"/>
+    <w:bookmarkStart w:id="35" w:name="evaluation-protocols-and-metrics"/>
     <w:p>
       <w:pPr>
         <w:pStyle w:val="Heading4"/>
@@ -7397,9 +7289,9 @@
         <w:t xml:space="preserve">- Bootstrap confidence intervals are computed over soils.</w:t>
       </w:r>
     </w:p>
-    <w:bookmarkEnd w:id="34"/>
     <w:bookmarkEnd w:id="35"/>
-    <w:bookmarkStart w:id="36" w:name="simulator-validation"/>
+    <w:bookmarkEnd w:id="36"/>
+    <w:bookmarkStart w:id="37" w:name="simulator-validation"/>
     <w:p>
       <w:pPr>
         <w:pStyle w:val="Heading3"/>
@@ -7643,8 +7535,8 @@
         <w:t xml:space="preserve">close.</w:t>
       </w:r>
     </w:p>
-    <w:bookmarkEnd w:id="36"/>
-    <w:bookmarkStart w:id="40" w:name="accuracy-on-the-lscc-soils"/>
+    <w:bookmarkEnd w:id="37"/>
+    <w:bookmarkStart w:id="41" w:name="accuracy-on-the-lscc-soils"/>
     <w:p>
       <w:pPr>
         <w:pStyle w:val="Heading3"/>
@@ -9222,18 +9114,18 @@
           <wp:inline>
             <wp:extent cx="5334000" cy="2774108"/>
             <wp:effectExtent b="0" l="0" r="0" t="0"/>
-            <wp:docPr descr="Figure 2" title="" id="38" name="Picture"/>
+            <wp:docPr descr="Figure 2" title="" id="39" name="Picture"/>
             <a:graphic>
               <a:graphicData uri="http://schemas.openxmlformats.org/drawingml/2006/picture">
                 <pic:pic>
                   <pic:nvPicPr>
-                    <pic:cNvPr descr="../figures/step06_pred_vs_true.png" id="39" name="Picture"/>
+                    <pic:cNvPr descr="../figures/step06_pred_vs_true.png" id="40" name="Picture"/>
                     <pic:cNvPicPr>
                       <a:picLocks noChangeArrowheads="1" noChangeAspect="1"/>
                     </pic:cNvPicPr>
                   </pic:nvPicPr>
                   <pic:blipFill>
-                    <a:blip r:embed="rId37"/>
+                    <a:blip r:embed="rId38"/>
                     <a:stretch>
                       <a:fillRect/>
                     </a:stretch>
@@ -9286,8 +9178,8 @@
         <w:t xml:space="preserve">LUMEN (A4) predictions against measured values for the 19 LSCC soils under LOSO.</w:t>
       </w:r>
     </w:p>
-    <w:bookmarkEnd w:id="40"/>
-    <w:bookmarkStart w:id="47" w:name="comparison-with-published-methods"/>
+    <w:bookmarkEnd w:id="41"/>
+    <w:bookmarkStart w:id="48" w:name="comparison-with-published-methods"/>
     <w:p>
       <w:pPr>
         <w:pStyle w:val="Heading3"/>
@@ -9296,7 +9188,7 @@
         <w:t xml:space="preserve">3.4. Comparison with Published Methods</w:t>
       </w:r>
     </w:p>
-    <w:bookmarkStart w:id="44" w:name="waveletautoencoder-feo-regression-16"/>
+    <w:bookmarkStart w:id="45" w:name="waveletautoencoder-feo-regression-16"/>
     <w:p>
       <w:pPr>
         <w:pStyle w:val="Heading4"/>
@@ -10288,18 +10180,18 @@
           <wp:inline>
             <wp:extent cx="5334000" cy="2171785"/>
             <wp:effectExtent b="0" l="0" r="0" t="0"/>
-            <wp:docPr descr="Figure 3" title="" id="42" name="Picture"/>
+            <wp:docPr descr="Figure 3" title="" id="43" name="Picture"/>
             <a:graphic>
               <a:graphicData uri="http://schemas.openxmlformats.org/drawingml/2006/picture">
                 <pic:pic>
                   <pic:nvPicPr>
-                    <pic:cNvPr descr="../figures/step06_fernandez_feo.png" id="43" name="Picture"/>
+                    <pic:cNvPr descr="../figures/step06_fernandez_feo.png" id="44" name="Picture"/>
                     <pic:cNvPicPr>
                       <a:picLocks noChangeArrowheads="1" noChangeAspect="1"/>
                     </pic:cNvPicPr>
                   </pic:nvPicPr>
                   <pic:blipFill>
-                    <a:blip r:embed="rId41"/>
+                    <a:blip r:embed="rId42"/>
                     <a:stretch>
                       <a:fillRect/>
                     </a:stretch>
@@ -10352,8 +10244,8 @@
         <w:t xml:space="preserve">FeO error of LUMEN and of the Fernández-Díaz et al. variants on identical folds.</w:t>
       </w:r>
     </w:p>
-    <w:bookmarkEnd w:id="44"/>
-    <w:bookmarkStart w:id="45" w:name="shkuratov-model-inversion-25"/>
+    <w:bookmarkEnd w:id="45"/>
+    <w:bookmarkStart w:id="46" w:name="shkuratov-model-inversion-25"/>
     <w:p>
       <w:pPr>
         <w:pStyle w:val="Heading4"/>
@@ -11010,8 +10902,8 @@
         </w:tc>
       </w:tr>
     </w:tbl>
-    <w:bookmarkEnd w:id="45"/>
-    <w:bookmarkStart w:id="46" w:name="hapkebayesian-inversion-26"/>
+    <w:bookmarkEnd w:id="46"/>
+    <w:bookmarkStart w:id="47" w:name="hapkebayesian-inversion-26"/>
     <w:p>
       <w:pPr>
         <w:pStyle w:val="Heading4"/>
@@ -11140,9 +11032,9 @@
         <w:t xml:space="preserve">r = 0.99, against r ≈ 0.00 for the inversion’s maturity index.</w:t>
       </w:r>
     </w:p>
-    <w:bookmarkEnd w:id="46"/>
     <w:bookmarkEnd w:id="47"/>
-    <w:bookmarkStart w:id="51" w:name="uncertainty-and-identifiability-1"/>
+    <w:bookmarkEnd w:id="48"/>
+    <w:bookmarkStart w:id="52" w:name="uncertainty-and-identifiability-1"/>
     <w:p>
       <w:pPr>
         <w:pStyle w:val="Heading3"/>
@@ -11993,18 +11885,18 @@
           <wp:inline>
             <wp:extent cx="5334000" cy="2425810"/>
             <wp:effectExtent b="0" l="0" r="0" t="0"/>
-            <wp:docPr descr="Figure 4" title="" id="49" name="Picture"/>
+            <wp:docPr descr="Figure 4" title="" id="50" name="Picture"/>
             <a:graphic>
               <a:graphicData uri="http://schemas.openxmlformats.org/drawingml/2006/picture">
                 <pic:pic>
                   <pic:nvPicPr>
-                    <pic:cNvPr descr="../figures/step05_coverage.png" id="50" name="Picture"/>
+                    <pic:cNvPr descr="../figures/step05_coverage.png" id="51" name="Picture"/>
                     <pic:cNvPicPr>
                       <a:picLocks noChangeArrowheads="1" noChangeAspect="1"/>
                     </pic:cNvPicPr>
                   </pic:nvPicPr>
                   <pic:blipFill>
-                    <a:blip r:embed="rId48"/>
+                    <a:blip r:embed="rId49"/>
                     <a:stretch>
                       <a:fillRect/>
                     </a:stretch>
@@ -12063,8 +11955,8 @@
         <w:t xml:space="preserve">conformal calibration, under LOSO and LOMO.</w:t>
       </w:r>
     </w:p>
-    <w:bookmarkEnd w:id="51"/>
-    <w:bookmarkStart w:id="55" w:name="X034a0d09804bb4b649341f37bd1cca15b9e3449"/>
+    <w:bookmarkEnd w:id="52"/>
+    <w:bookmarkStart w:id="56" w:name="X034a0d09804bb4b649341f37bd1cca15b9e3449"/>
     <w:p>
       <w:pPr>
         <w:pStyle w:val="Heading3"/>
@@ -14335,18 +14227,18 @@
           <wp:inline>
             <wp:extent cx="5334000" cy="1879600"/>
             <wp:effectExtent b="0" l="0" r="0" t="0"/>
-            <wp:docPr descr="Figure 5" title="" id="53" name="Picture"/>
+            <wp:docPr descr="Figure 5" title="" id="54" name="Picture"/>
             <a:graphic>
               <a:graphicData uri="http://schemas.openxmlformats.org/drawingml/2006/picture">
                 <pic:pic>
                   <pic:nvPicPr>
-                    <pic:cNvPr descr="../figures/fig05_m3_sites.png" id="54" name="Picture"/>
+                    <pic:cNvPr descr="../figures/fig05_m3_sites.png" id="55" name="Picture"/>
                     <pic:cNvPicPr>
                       <a:picLocks noChangeArrowheads="1" noChangeAspect="1"/>
                     </pic:cNvPicPr>
                   </pic:nvPicPr>
                   <pic:blipFill>
-                    <a:blip r:embed="rId52"/>
+                    <a:blip r:embed="rId53"/>
                     <a:stretch>
                       <a:fillRect/>
                     </a:stretch>
@@ -14411,8 +14303,8 @@
         <w:t xml:space="preserve">Marker shape gives the landing site; the line is 1:1.</w:t>
       </w:r>
     </w:p>
-    <w:bookmarkEnd w:id="55"/>
-    <w:bookmarkStart w:id="56" w:name="ablations-and-parameter-analysis"/>
+    <w:bookmarkEnd w:id="56"/>
+    <w:bookmarkStart w:id="57" w:name="ablations-and-parameter-analysis"/>
     <w:p>
       <w:pPr>
         <w:pStyle w:val="Heading3"/>
@@ -16529,8 +16421,8 @@
         </w:tc>
       </w:tr>
     </w:tbl>
-    <w:bookmarkEnd w:id="56"/>
-    <w:bookmarkStart w:id="60" w:name="application-to-m³-scenes"/>
+    <w:bookmarkEnd w:id="57"/>
+    <w:bookmarkStart w:id="61" w:name="application-to-m³-scenes"/>
     <w:p>
       <w:pPr>
         <w:pStyle w:val="Heading3"/>
@@ -16708,18 +16600,18 @@
           <wp:inline>
             <wp:extent cx="5334000" cy="3146822"/>
             <wp:effectExtent b="0" l="0" r="0" t="0"/>
-            <wp:docPr descr="Figure 6" title="" id="58" name="Picture"/>
+            <wp:docPr descr="Figure 6" title="" id="59" name="Picture"/>
             <a:graphic>
               <a:graphicData uri="http://schemas.openxmlformats.org/drawingml/2006/picture">
                 <pic:pic>
                   <pic:nvPicPr>
-                    <pic:cNvPr descr="../figures/step07_shapley_maps.png" id="59" name="Picture"/>
+                    <pic:cNvPr descr="../figures/step07_shapley_maps.png" id="60" name="Picture"/>
                     <pic:cNvPicPr>
                       <a:picLocks noChangeArrowheads="1" noChangeAspect="1"/>
                     </pic:cNvPicPr>
                   </pic:nvPicPr>
                   <pic:blipFill>
-                    <a:blip r:embed="rId57"/>
+                    <a:blip r:embed="rId58"/>
                     <a:stretch>
                       <a:fillRect/>
                     </a:stretch>
@@ -16784,9 +16676,9 @@
         <w:t xml:space="preserve">are withheld by the identifiability gate.</w:t>
       </w:r>
     </w:p>
-    <w:bookmarkEnd w:id="60"/>
     <w:bookmarkEnd w:id="61"/>
-    <w:bookmarkStart w:id="67" w:name="discussion"/>
+    <w:bookmarkEnd w:id="62"/>
+    <w:bookmarkStart w:id="68" w:name="discussion"/>
     <w:p>
       <w:pPr>
         <w:pStyle w:val="Heading2"/>
@@ -16795,7 +16687,7 @@
         <w:t xml:space="preserve">4. Discussion</w:t>
       </w:r>
     </w:p>
-    <w:bookmarkStart w:id="62" w:name="Xe6bde06f441fb128f62d0026fd42eb65b450b2f"/>
+    <w:bookmarkStart w:id="63" w:name="Xe6bde06f441fb128f62d0026fd42eb65b450b2f"/>
     <w:p>
       <w:pPr>
         <w:pStyle w:val="Heading3"/>
@@ -17094,8 +16986,8 @@
         <w:t xml:space="preserve">seeing the results.</w:t>
       </w:r>
     </w:p>
-    <w:bookmarkEnd w:id="62"/>
-    <w:bookmarkStart w:id="63" w:name="X89b6e2467fefe970bb4c0345a8d1bb09cf146cc"/>
+    <w:bookmarkEnd w:id="63"/>
+    <w:bookmarkStart w:id="64" w:name="X89b6e2467fefe970bb4c0345a8d1bb09cf146cc"/>
     <w:p>
       <w:pPr>
         <w:pStyle w:val="Heading3"/>
@@ -17228,8 +17120,8 @@
         <w:t xml:space="preserve">This is a concrete and practically relevant difference.</w:t>
       </w:r>
     </w:p>
-    <w:bookmarkEnd w:id="63"/>
-    <w:bookmarkStart w:id="64" w:name="X239668b55a24bc6056d13e4b7f00680a51642c0"/>
+    <w:bookmarkEnd w:id="64"/>
+    <w:bookmarkStart w:id="65" w:name="X239668b55a24bc6056d13e4b7f00680a51642c0"/>
     <w:p>
       <w:pPr>
         <w:pStyle w:val="Heading3"/>
@@ -17600,8 +17492,8 @@
         <w:t xml:space="preserve">- on the unflagged targets, LUMEN reproduces the expected mare–highland contrasts.</w:t>
       </w:r>
     </w:p>
-    <w:bookmarkEnd w:id="64"/>
-    <w:bookmarkStart w:id="65" w:name="uncertainty-and-identifiability-2"/>
+    <w:bookmarkEnd w:id="65"/>
+    <w:bookmarkStart w:id="66" w:name="uncertainty-and-identifiability-2"/>
     <w:p>
       <w:pPr>
         <w:pStyle w:val="Heading3"/>
@@ -17724,8 +17616,8 @@
         <w:t xml:space="preserve">claim that olivine is undetectable where it is abundant.</w:t>
       </w:r>
     </w:p>
-    <w:bookmarkEnd w:id="65"/>
-    <w:bookmarkStart w:id="66" w:name="limitations"/>
+    <w:bookmarkEnd w:id="66"/>
+    <w:bookmarkStart w:id="67" w:name="limitations"/>
     <w:p>
       <w:pPr>
         <w:pStyle w:val="Heading3"/>
@@ -17926,9 +17818,9 @@
         <w:t xml:space="preserve">Chandrayaan-2 IIRS, whose radiometry and band set differ, is not tested here.</w:t>
       </w:r>
     </w:p>
-    <w:bookmarkEnd w:id="66"/>
     <w:bookmarkEnd w:id="67"/>
-    <w:bookmarkStart w:id="68" w:name="conclusions"/>
+    <w:bookmarkEnd w:id="68"/>
+    <w:bookmarkStart w:id="69" w:name="conclusions"/>
     <w:p>
       <w:pPr>
         <w:pStyle w:val="Heading2"/>
@@ -18201,133 +18093,25 @@
         <w:t xml:space="preserve"> </w:t>
       </w:r>
       <w:r>
-        <w:t xml:space="preserve">-</w:t>
-      </w:r>
-      <w:r>
-        <w:t xml:space="preserve"> </w:t>
-      </w:r>
+        <w:t xml:space="preserve">All code, the version-controlled evaluation protocol, every intermediate table and the staged input data, with their SHA-256 manifests, are available at https://github.com/DSheth2004/lumen-lunar-dl. RELAB spectra are available from the PDS Geosciences Node spectral library, and M³ data from the NASA Planetary Data System. The returned-sample FeO table is Supplementary Table 1 of Qiu et al. [31].</w:t>
+      </w:r>
+    </w:p>
+    <w:p>
+      <w:pPr>
+        <w:pStyle w:val="BodyText"/>
+      </w:pPr>
       <w:r>
         <w:rPr>
           <w:b/>
           <w:bCs/>
         </w:rPr>
-        <w:t xml:space="preserve">Code and data.</w:t>
-      </w:r>
-      <w:r>
-        <w:t xml:space="preserve"> </w:t>
-      </w:r>
-      <w:r>
-        <w:t xml:space="preserve">All code, the version-controlled evaluation protocol, every intermediate</w:t>
-      </w:r>
-      <w:r>
-        <w:t xml:space="preserve"> </w:t>
-      </w:r>
-      <w:r>
-        <w:t xml:space="preserve">table and the staged input data, with their SHA-256 manifests, are available at</w:t>
-      </w:r>
-      <w:r>
-        <w:t xml:space="preserve"> </w:t>
-      </w:r>
-      <w:r>
-        <w:t xml:space="preserve">https://github.com/DSheth2004/lumen-lunar-dl.</w:t>
-      </w:r>
-      <w:r>
-        <w:t xml:space="preserve"> </w:t>
-      </w:r>
-      <w:r>
-        <w:t xml:space="preserve">-</w:t>
-      </w:r>
-      <w:r>
-        <w:t xml:space="preserve"> </w:t>
-      </w:r>
-      <w:r>
-        <w:rPr>
-          <w:b/>
-          <w:bCs/>
-        </w:rPr>
-        <w:t xml:space="preserve">Source data.</w:t>
-      </w:r>
-      <w:r>
-        <w:t xml:space="preserve"> </w:t>
-      </w:r>
-      <w:r>
-        <w:t xml:space="preserve">RELAB spectra are available from the PDS Geosciences Node spectral library. M³</w:t>
-      </w:r>
-      <w:r>
-        <w:t xml:space="preserve"> </w:t>
-      </w:r>
-      <w:r>
-        <w:t xml:space="preserve">data are available from the NASA Planetary Data System. The returned-sample FeO table is</w:t>
-      </w:r>
-      <w:r>
-        <w:t xml:space="preserve"> </w:t>
-      </w:r>
-      <w:r>
-        <w:t xml:space="preserve">Supplementary Table 1 of Qiu et al. [31].</w:t>
-      </w:r>
-    </w:p>
-    <w:p>
-      <w:pPr>
-        <w:pStyle w:val="BodyText"/>
-      </w:pPr>
-      <w:r>
-        <w:rPr>
-          <w:b/>
-          <w:bCs/>
-        </w:rPr>
         <w:t xml:space="preserve">Acknowledgments:</w:t>
       </w:r>
       <w:r>
         <w:t xml:space="preserve"> </w:t>
       </w:r>
       <w:r>
-        <w:t xml:space="preserve">- We thank the RELAB facility at Brown University and the Lunar Soil Characterization Consortium</w:t>
-      </w:r>
-      <w:r>
-        <w:t xml:space="preserve"> </w:t>
-      </w:r>
-      <w:r>
-        <w:t xml:space="preserve">for the laboratory data, and the M³ team and the Planetary Data System for the orbital data.</w:t>
-      </w:r>
-      <w:r>
-        <w:t xml:space="preserve"> </w:t>
-      </w:r>
-      <w:r>
-        <w:t xml:space="preserve">-</w:t>
-      </w:r>
-      <w:r>
-        <w:t xml:space="preserve"> </w:t>
-      </w:r>
-      <w:r>
-        <w:rPr>
-          <w:b/>
-          <w:bCs/>
-        </w:rPr>
-        <w:t xml:space="preserve">AI-assisted work.</w:t>
-      </w:r>
-      <w:r>
-        <w:t xml:space="preserve"> </w:t>
-      </w:r>
-      <w:r>
-        <w:t xml:space="preserve">Parts of the analysis code and the text were drafted with the assistance</w:t>
-      </w:r>
-      <w:r>
-        <w:t xml:space="preserve"> </w:t>
-      </w:r>
-      <w:r>
-        <w:t xml:space="preserve">of an AI system (Anthropic Claude). All results were generated by the released code, and the</w:t>
-      </w:r>
-      <w:r>
-        <w:t xml:space="preserve"> </w:t>
-      </w:r>
-      <w:r>
-        <w:t xml:space="preserve">authors reviewed and take responsibility for the content. [Authors to confirm and adapt to the</w:t>
-      </w:r>
-      <w:r>
-        <w:t xml:space="preserve"> </w:t>
-      </w:r>
-      <w:r>
-        <w:t xml:space="preserve">journal’s policy.]</w:t>
+        <w:t xml:space="preserve">We thank the RELAB facility at Brown University and the Lunar Soil Characterization Consortium for the laboratory data, and the M³ team and the Planetary Data System for the orbital data.</w:t>
       </w:r>
     </w:p>
     <w:p>
@@ -18782,8 +18566,8 @@
         </w:tc>
       </w:tr>
     </w:tbl>
-    <w:bookmarkEnd w:id="68"/>
-    <w:bookmarkStart w:id="69" w:name="references"/>
+    <w:bookmarkEnd w:id="69"/>
+    <w:bookmarkStart w:id="70" w:name="references"/>
     <w:p>
       <w:pPr>
         <w:pStyle w:val="Heading2"/>
@@ -18797,7 +18581,7 @@
         <w:pStyle w:val="Compact"/>
         <w:numPr>
           <w:ilvl w:val="0"/>
-          <w:numId w:val="1010"/>
+          <w:numId w:val="1009"/>
         </w:numPr>
       </w:pPr>
       <w:r>
@@ -18845,7 +18629,7 @@
         <w:pStyle w:val="Compact"/>
         <w:numPr>
           <w:ilvl w:val="0"/>
-          <w:numId w:val="1010"/>
+          <w:numId w:val="1009"/>
         </w:numPr>
       </w:pPr>
       <w:r>
@@ -18893,7 +18677,7 @@
         <w:pStyle w:val="Compact"/>
         <w:numPr>
           <w:ilvl w:val="0"/>
-          <w:numId w:val="1010"/>
+          <w:numId w:val="1009"/>
         </w:numPr>
       </w:pPr>
       <w:r>
@@ -18941,7 +18725,7 @@
         <w:pStyle w:val="Compact"/>
         <w:numPr>
           <w:ilvl w:val="0"/>
-          <w:numId w:val="1010"/>
+          <w:numId w:val="1009"/>
         </w:numPr>
       </w:pPr>
       <w:r>
@@ -18989,7 +18773,7 @@
         <w:pStyle w:val="Compact"/>
         <w:numPr>
           <w:ilvl w:val="0"/>
-          <w:numId w:val="1010"/>
+          <w:numId w:val="1009"/>
         </w:numPr>
       </w:pPr>
       <w:r>
@@ -19037,7 +18821,7 @@
         <w:pStyle w:val="Compact"/>
         <w:numPr>
           <w:ilvl w:val="0"/>
-          <w:numId w:val="1010"/>
+          <w:numId w:val="1009"/>
         </w:numPr>
       </w:pPr>
       <w:r>
@@ -19085,7 +18869,7 @@
         <w:pStyle w:val="Compact"/>
         <w:numPr>
           <w:ilvl w:val="0"/>
-          <w:numId w:val="1010"/>
+          <w:numId w:val="1009"/>
         </w:numPr>
       </w:pPr>
       <w:r>
@@ -19133,7 +18917,7 @@
         <w:pStyle w:val="Compact"/>
         <w:numPr>
           <w:ilvl w:val="0"/>
-          <w:numId w:val="1010"/>
+          <w:numId w:val="1009"/>
         </w:numPr>
       </w:pPr>
       <w:r>
@@ -19181,7 +18965,7 @@
         <w:pStyle w:val="Compact"/>
         <w:numPr>
           <w:ilvl w:val="0"/>
-          <w:numId w:val="1010"/>
+          <w:numId w:val="1009"/>
         </w:numPr>
       </w:pPr>
       <w:r>
@@ -19229,7 +19013,7 @@
         <w:pStyle w:val="Compact"/>
         <w:numPr>
           <w:ilvl w:val="0"/>
-          <w:numId w:val="1010"/>
+          <w:numId w:val="1009"/>
         </w:numPr>
       </w:pPr>
       <w:r>
@@ -19277,7 +19061,7 @@
         <w:pStyle w:val="Compact"/>
         <w:numPr>
           <w:ilvl w:val="0"/>
-          <w:numId w:val="1010"/>
+          <w:numId w:val="1009"/>
         </w:numPr>
       </w:pPr>
       <w:r>
@@ -19325,7 +19109,7 @@
         <w:pStyle w:val="Compact"/>
         <w:numPr>
           <w:ilvl w:val="0"/>
-          <w:numId w:val="1010"/>
+          <w:numId w:val="1009"/>
         </w:numPr>
       </w:pPr>
       <w:r>
@@ -19373,7 +19157,7 @@
         <w:pStyle w:val="Compact"/>
         <w:numPr>
           <w:ilvl w:val="0"/>
-          <w:numId w:val="1010"/>
+          <w:numId w:val="1009"/>
         </w:numPr>
       </w:pPr>
       <w:r>
@@ -19421,7 +19205,7 @@
         <w:pStyle w:val="Compact"/>
         <w:numPr>
           <w:ilvl w:val="0"/>
-          <w:numId w:val="1010"/>
+          <w:numId w:val="1009"/>
         </w:numPr>
       </w:pPr>
       <w:r>
@@ -19469,7 +19253,7 @@
         <w:pStyle w:val="Compact"/>
         <w:numPr>
           <w:ilvl w:val="0"/>
-          <w:numId w:val="1010"/>
+          <w:numId w:val="1009"/>
         </w:numPr>
       </w:pPr>
       <w:r>
@@ -19517,7 +19301,7 @@
         <w:pStyle w:val="Compact"/>
         <w:numPr>
           <w:ilvl w:val="0"/>
-          <w:numId w:val="1010"/>
+          <w:numId w:val="1009"/>
         </w:numPr>
       </w:pPr>
       <w:r>
@@ -19565,7 +19349,7 @@
         <w:pStyle w:val="Compact"/>
         <w:numPr>
           <w:ilvl w:val="0"/>
-          <w:numId w:val="1010"/>
+          <w:numId w:val="1009"/>
         </w:numPr>
       </w:pPr>
       <w:r>
@@ -19590,7 +19374,7 @@
         <w:pStyle w:val="Compact"/>
         <w:numPr>
           <w:ilvl w:val="0"/>
-          <w:numId w:val="1010"/>
+          <w:numId w:val="1009"/>
         </w:numPr>
       </w:pPr>
       <w:r>
@@ -19638,7 +19422,7 @@
         <w:pStyle w:val="Compact"/>
         <w:numPr>
           <w:ilvl w:val="0"/>
-          <w:numId w:val="1010"/>
+          <w:numId w:val="1009"/>
         </w:numPr>
       </w:pPr>
       <w:r>
@@ -19686,7 +19470,7 @@
         <w:pStyle w:val="Compact"/>
         <w:numPr>
           <w:ilvl w:val="0"/>
-          <w:numId w:val="1010"/>
+          <w:numId w:val="1009"/>
         </w:numPr>
       </w:pPr>
       <w:r>
@@ -19734,7 +19518,7 @@
         <w:pStyle w:val="Compact"/>
         <w:numPr>
           <w:ilvl w:val="0"/>
-          <w:numId w:val="1010"/>
+          <w:numId w:val="1009"/>
         </w:numPr>
       </w:pPr>
       <w:r>
@@ -19782,7 +19566,7 @@
         <w:pStyle w:val="Compact"/>
         <w:numPr>
           <w:ilvl w:val="0"/>
-          <w:numId w:val="1010"/>
+          <w:numId w:val="1009"/>
         </w:numPr>
       </w:pPr>
       <w:r>
@@ -19830,7 +19614,7 @@
         <w:pStyle w:val="Compact"/>
         <w:numPr>
           <w:ilvl w:val="0"/>
-          <w:numId w:val="1010"/>
+          <w:numId w:val="1009"/>
         </w:numPr>
       </w:pPr>
       <w:r>
@@ -19878,7 +19662,7 @@
         <w:pStyle w:val="Compact"/>
         <w:numPr>
           <w:ilvl w:val="0"/>
-          <w:numId w:val="1010"/>
+          <w:numId w:val="1009"/>
         </w:numPr>
       </w:pPr>
       <w:r>
@@ -19926,7 +19710,7 @@
         <w:pStyle w:val="Compact"/>
         <w:numPr>
           <w:ilvl w:val="0"/>
-          <w:numId w:val="1010"/>
+          <w:numId w:val="1009"/>
         </w:numPr>
       </w:pPr>
       <w:r>
@@ -19974,7 +19758,7 @@
         <w:pStyle w:val="Compact"/>
         <w:numPr>
           <w:ilvl w:val="0"/>
-          <w:numId w:val="1010"/>
+          <w:numId w:val="1009"/>
         </w:numPr>
       </w:pPr>
       <w:r>
@@ -20022,7 +19806,7 @@
         <w:pStyle w:val="Compact"/>
         <w:numPr>
           <w:ilvl w:val="0"/>
-          <w:numId w:val="1010"/>
+          <w:numId w:val="1009"/>
         </w:numPr>
       </w:pPr>
       <w:r>
@@ -20070,7 +19854,7 @@
         <w:pStyle w:val="Compact"/>
         <w:numPr>
           <w:ilvl w:val="0"/>
-          <w:numId w:val="1010"/>
+          <w:numId w:val="1009"/>
         </w:numPr>
       </w:pPr>
       <w:r>
@@ -20118,7 +19902,7 @@
         <w:pStyle w:val="Compact"/>
         <w:numPr>
           <w:ilvl w:val="0"/>
-          <w:numId w:val="1010"/>
+          <w:numId w:val="1009"/>
         </w:numPr>
       </w:pPr>
       <w:r>
@@ -20166,7 +19950,7 @@
         <w:pStyle w:val="Compact"/>
         <w:numPr>
           <w:ilvl w:val="0"/>
-          <w:numId w:val="1010"/>
+          <w:numId w:val="1009"/>
         </w:numPr>
       </w:pPr>
       <w:r>
@@ -20214,7 +19998,7 @@
         <w:pStyle w:val="Compact"/>
         <w:numPr>
           <w:ilvl w:val="0"/>
-          <w:numId w:val="1010"/>
+          <w:numId w:val="1009"/>
         </w:numPr>
       </w:pPr>
       <w:r>
@@ -20262,7 +20046,7 @@
         <w:pStyle w:val="Compact"/>
         <w:numPr>
           <w:ilvl w:val="0"/>
-          <w:numId w:val="1010"/>
+          <w:numId w:val="1009"/>
         </w:numPr>
       </w:pPr>
       <w:r>
@@ -20310,7 +20094,7 @@
         <w:pStyle w:val="Compact"/>
         <w:numPr>
           <w:ilvl w:val="0"/>
-          <w:numId w:val="1010"/>
+          <w:numId w:val="1009"/>
         </w:numPr>
       </w:pPr>
       <w:r>
@@ -20358,7 +20142,7 @@
         <w:pStyle w:val="Compact"/>
         <w:numPr>
           <w:ilvl w:val="0"/>
-          <w:numId w:val="1010"/>
+          <w:numId w:val="1009"/>
         </w:numPr>
       </w:pPr>
       <w:r>
@@ -20370,7 +20154,7 @@
         <w:pStyle w:val="Compact"/>
         <w:numPr>
           <w:ilvl w:val="0"/>
-          <w:numId w:val="1010"/>
+          <w:numId w:val="1009"/>
         </w:numPr>
       </w:pPr>
       <w:r>
@@ -20418,7 +20202,7 @@
         <w:pStyle w:val="Compact"/>
         <w:numPr>
           <w:ilvl w:val="0"/>
-          <w:numId w:val="1010"/>
+          <w:numId w:val="1009"/>
         </w:numPr>
       </w:pPr>
       <w:r>
@@ -20430,7 +20214,7 @@
         <w:pStyle w:val="Compact"/>
         <w:numPr>
           <w:ilvl w:val="0"/>
-          <w:numId w:val="1010"/>
+          <w:numId w:val="1009"/>
         </w:numPr>
       </w:pPr>
       <w:r>
@@ -20455,7 +20239,7 @@
         <w:pStyle w:val="Compact"/>
         <w:numPr>
           <w:ilvl w:val="0"/>
-          <w:numId w:val="1010"/>
+          <w:numId w:val="1009"/>
         </w:numPr>
       </w:pPr>
       <w:r>
@@ -20503,7 +20287,7 @@
         <w:pStyle w:val="Compact"/>
         <w:numPr>
           <w:ilvl w:val="0"/>
-          <w:numId w:val="1010"/>
+          <w:numId w:val="1009"/>
         </w:numPr>
       </w:pPr>
       <w:r>
@@ -20551,7 +20335,7 @@
         <w:pStyle w:val="Compact"/>
         <w:numPr>
           <w:ilvl w:val="0"/>
-          <w:numId w:val="1010"/>
+          <w:numId w:val="1009"/>
         </w:numPr>
       </w:pPr>
       <w:r>
@@ -20594,8 +20378,8 @@
         <w:t xml:space="preserve">, 65–70.</w:t>
       </w:r>
     </w:p>
-    <w:bookmarkEnd w:id="69"/>
     <w:bookmarkEnd w:id="70"/>
+    <w:bookmarkEnd w:id="71"/>
     <w:sectPr>
       <w:footnotePr>
         <w:numRestart w:val="eachSect"/>
@@ -21159,9 +20943,6 @@
     <w:abstractNumId w:val="991"/>
   </w:num>
   <w:num w:numId="1003">
-    <w:abstractNumId w:val="991"/>
-  </w:num>
-  <w:num w:numId="1004">
     <w:abstractNumId w:val="99431"/>
     <w:lvlOverride w:ilvl="0">
       <w:startOverride w:val="1"/>
@@ -21191,10 +20972,10 @@
       <w:startOverride w:val="1"/>
     </w:lvlOverride>
   </w:num>
-  <w:num w:numId="1005">
+  <w:num w:numId="1004">
     <w:abstractNumId w:val="991"/>
   </w:num>
-  <w:num w:numId="1006">
+  <w:num w:numId="1005">
     <w:abstractNumId w:val="99432"/>
     <w:lvlOverride w:ilvl="0">
       <w:startOverride w:val="2"/>
@@ -21224,10 +21005,10 @@
       <w:startOverride w:val="2"/>
     </w:lvlOverride>
   </w:num>
-  <w:num w:numId="1007">
+  <w:num w:numId="1006">
     <w:abstractNumId w:val="991"/>
   </w:num>
-  <w:num w:numId="1008">
+  <w:num w:numId="1007">
     <w:abstractNumId w:val="99433"/>
     <w:lvlOverride w:ilvl="0">
       <w:startOverride w:val="3"/>
@@ -21257,10 +21038,10 @@
       <w:startOverride w:val="3"/>
     </w:lvlOverride>
   </w:num>
-  <w:num w:numId="1009">
+  <w:num w:numId="1008">
     <w:abstractNumId w:val="991"/>
   </w:num>
-  <w:num w:numId="1010">
+  <w:num w:numId="1009">
     <w:abstractNumId w:val="99411"/>
     <w:lvlOverride w:ilvl="0">
       <w:startOverride w:val="1"/>

</xml_diff>

<commit_message>
LUMEN paper: remove the AI-use section (authors will add it); add PDF build
- Section 2.4 (generative-AI disclosure) is removed at the authors' request; they will add it
  later. No AI mention remains in the manuscript.
- paper/build_pdf.py exports MANUSCRIPT_MDPI.docx to MANUSCRIPT_MDPI.pdf through Microsoft Word,
  so the PDF matches the Word layout (27 pages).
- Full rebuild: python build_manuscript.py && python build_mdpi_docx.py && python build_pdf.py

Co-Authored-By: Claude Opus 5.5 <noreply@anthropic.com>
</commit_message>
<xml_diff>
--- a/LUMEN_HybridDL/paper/MANUSCRIPT.docx
+++ b/LUMEN_HybridDL/paper/MANUSCRIPT.docx
@@ -2,7 +2,7 @@
 <file path=word/document.xml><?xml version="1.0" encoding="utf-8"?>
 <w:document xmlns:w="http://schemas.openxmlformats.org/wordprocessingml/2006/main" xmlns:m="http://schemas.openxmlformats.org/officeDocument/2006/math" xmlns:r="http://schemas.openxmlformats.org/officeDocument/2006/relationships" xmlns:o="urn:schemas-microsoft-com:office:office" xmlns:v="urn:schemas-microsoft-com:vml" xmlns:w10="urn:schemas-microsoft-com:office:word" xmlns:a="http://schemas.openxmlformats.org/drawingml/2006/main" xmlns:pic="http://schemas.openxmlformats.org/drawingml/2006/picture" xmlns:wp="http://schemas.openxmlformats.org/drawingml/2006/wordprocessingDrawing">
   <w:body>
-    <w:bookmarkStart w:id="71" w:name="X1b940ee9ca712b8874ab3c96a4cef274b19d27e"/>
+    <w:bookmarkStart w:id="70" w:name="X1b940ee9ca712b8874ab3c96a4cef274b19d27e"/>
     <w:p>
       <w:pPr>
         <w:pStyle w:val="Heading1"/>
@@ -1110,7 +1110,7 @@
       </w:r>
     </w:p>
     <w:bookmarkEnd w:id="11"/>
-    <w:bookmarkStart w:id="32" w:name="materials-and-methods"/>
+    <w:bookmarkStart w:id="31" w:name="materials-and-methods"/>
     <w:p>
       <w:pPr>
         <w:pStyle w:val="Heading2"/>
@@ -6452,44 +6452,26 @@
     </w:p>
     <w:bookmarkEnd w:id="29"/>
     <w:bookmarkEnd w:id="30"/>
-    <w:bookmarkStart w:id="31" w:name="X662c2d66dd1eda3268d2087202c966cd73b2601"/>
+    <w:bookmarkEnd w:id="31"/>
+    <w:bookmarkStart w:id="61" w:name="results"/>
+    <w:p>
+      <w:pPr>
+        <w:pStyle w:val="Heading2"/>
+      </w:pPr>
+      <w:r>
+        <w:t xml:space="preserve">3. Results</w:t>
+      </w:r>
+    </w:p>
+    <w:bookmarkStart w:id="35" w:name="experimental-setup"/>
     <w:p>
       <w:pPr>
         <w:pStyle w:val="Heading3"/>
       </w:pPr>
       <w:r>
-        <w:t xml:space="preserve">2.4. Use of Generative Artificial Intelligence</w:t>
-      </w:r>
-    </w:p>
-    <w:p>
-      <w:pPr>
-        <w:pStyle w:val="FirstParagraph"/>
-      </w:pPr>
-      <w:r>
-        <w:t xml:space="preserve">Parts of the analysis code and of the manuscript text were drafted with the assistance of a generative AI system (Anthropic Claude). The AI system was not used to generate data. Every reported number was produced by the released code from the staged input data, and the evaluation protocol was fixed in version control before scoring. The authors reviewed the code, the analysis and the text, and take full responsibility for the content.</w:t>
-      </w:r>
-    </w:p>
-    <w:bookmarkEnd w:id="31"/>
-    <w:bookmarkEnd w:id="32"/>
-    <w:bookmarkStart w:id="62" w:name="results"/>
-    <w:p>
-      <w:pPr>
-        <w:pStyle w:val="Heading2"/>
-      </w:pPr>
-      <w:r>
-        <w:t xml:space="preserve">3. Results</w:t>
-      </w:r>
-    </w:p>
-    <w:bookmarkStart w:id="36" w:name="experimental-setup"/>
-    <w:p>
-      <w:pPr>
-        <w:pStyle w:val="Heading3"/>
-      </w:pPr>
-      <w:r>
         <w:t xml:space="preserve">3.1. Experimental Setup</w:t>
       </w:r>
     </w:p>
-    <w:bookmarkStart w:id="33" w:name="comparison-algorithms"/>
+    <w:bookmarkStart w:id="32" w:name="comparison-algorithms"/>
     <w:p>
       <w:pPr>
         <w:pStyle w:val="Heading4"/>
@@ -6824,8 +6806,8 @@
         <w:t xml:space="preserve">- The training-fold mean.</w:t>
       </w:r>
     </w:p>
-    <w:bookmarkEnd w:id="33"/>
-    <w:bookmarkStart w:id="34" w:name="parameter-settings"/>
+    <w:bookmarkEnd w:id="32"/>
+    <w:bookmarkStart w:id="33" w:name="parameter-settings"/>
     <w:p>
       <w:pPr>
         <w:pStyle w:val="Heading4"/>
@@ -7151,8 +7133,8 @@
         </w:tc>
       </w:tr>
     </w:tbl>
-    <w:bookmarkEnd w:id="34"/>
-    <w:bookmarkStart w:id="35" w:name="evaluation-protocols-and-metrics"/>
+    <w:bookmarkEnd w:id="33"/>
+    <w:bookmarkStart w:id="34" w:name="evaluation-protocols-and-metrics"/>
     <w:p>
       <w:pPr>
         <w:pStyle w:val="Heading4"/>
@@ -7289,9 +7271,9 @@
         <w:t xml:space="preserve">- Bootstrap confidence intervals are computed over soils.</w:t>
       </w:r>
     </w:p>
+    <w:bookmarkEnd w:id="34"/>
     <w:bookmarkEnd w:id="35"/>
-    <w:bookmarkEnd w:id="36"/>
-    <w:bookmarkStart w:id="37" w:name="simulator-validation"/>
+    <w:bookmarkStart w:id="36" w:name="simulator-validation"/>
     <w:p>
       <w:pPr>
         <w:pStyle w:val="Heading3"/>
@@ -7535,8 +7517,8 @@
         <w:t xml:space="preserve">close.</w:t>
       </w:r>
     </w:p>
-    <w:bookmarkEnd w:id="37"/>
-    <w:bookmarkStart w:id="41" w:name="accuracy-on-the-lscc-soils"/>
+    <w:bookmarkEnd w:id="36"/>
+    <w:bookmarkStart w:id="40" w:name="accuracy-on-the-lscc-soils"/>
     <w:p>
       <w:pPr>
         <w:pStyle w:val="Heading3"/>
@@ -9114,18 +9096,18 @@
           <wp:inline>
             <wp:extent cx="5334000" cy="2774108"/>
             <wp:effectExtent b="0" l="0" r="0" t="0"/>
-            <wp:docPr descr="Figure 2" title="" id="39" name="Picture"/>
+            <wp:docPr descr="Figure 2" title="" id="38" name="Picture"/>
             <a:graphic>
               <a:graphicData uri="http://schemas.openxmlformats.org/drawingml/2006/picture">
                 <pic:pic>
                   <pic:nvPicPr>
-                    <pic:cNvPr descr="../figures/step06_pred_vs_true.png" id="40" name="Picture"/>
+                    <pic:cNvPr descr="../figures/step06_pred_vs_true.png" id="39" name="Picture"/>
                     <pic:cNvPicPr>
                       <a:picLocks noChangeArrowheads="1" noChangeAspect="1"/>
                     </pic:cNvPicPr>
                   </pic:nvPicPr>
                   <pic:blipFill>
-                    <a:blip r:embed="rId38"/>
+                    <a:blip r:embed="rId37"/>
                     <a:stretch>
                       <a:fillRect/>
                     </a:stretch>
@@ -9178,8 +9160,8 @@
         <w:t xml:space="preserve">LUMEN (A4) predictions against measured values for the 19 LSCC soils under LOSO.</w:t>
       </w:r>
     </w:p>
-    <w:bookmarkEnd w:id="41"/>
-    <w:bookmarkStart w:id="48" w:name="comparison-with-published-methods"/>
+    <w:bookmarkEnd w:id="40"/>
+    <w:bookmarkStart w:id="47" w:name="comparison-with-published-methods"/>
     <w:p>
       <w:pPr>
         <w:pStyle w:val="Heading3"/>
@@ -9188,7 +9170,7 @@
         <w:t xml:space="preserve">3.4. Comparison with Published Methods</w:t>
       </w:r>
     </w:p>
-    <w:bookmarkStart w:id="45" w:name="waveletautoencoder-feo-regression-16"/>
+    <w:bookmarkStart w:id="44" w:name="waveletautoencoder-feo-regression-16"/>
     <w:p>
       <w:pPr>
         <w:pStyle w:val="Heading4"/>
@@ -10180,18 +10162,18 @@
           <wp:inline>
             <wp:extent cx="5334000" cy="2171785"/>
             <wp:effectExtent b="0" l="0" r="0" t="0"/>
-            <wp:docPr descr="Figure 3" title="" id="43" name="Picture"/>
+            <wp:docPr descr="Figure 3" title="" id="42" name="Picture"/>
             <a:graphic>
               <a:graphicData uri="http://schemas.openxmlformats.org/drawingml/2006/picture">
                 <pic:pic>
                   <pic:nvPicPr>
-                    <pic:cNvPr descr="../figures/step06_fernandez_feo.png" id="44" name="Picture"/>
+                    <pic:cNvPr descr="../figures/step06_fernandez_feo.png" id="43" name="Picture"/>
                     <pic:cNvPicPr>
                       <a:picLocks noChangeArrowheads="1" noChangeAspect="1"/>
                     </pic:cNvPicPr>
                   </pic:nvPicPr>
                   <pic:blipFill>
-                    <a:blip r:embed="rId42"/>
+                    <a:blip r:embed="rId41"/>
                     <a:stretch>
                       <a:fillRect/>
                     </a:stretch>
@@ -10244,8 +10226,8 @@
         <w:t xml:space="preserve">FeO error of LUMEN and of the Fernández-Díaz et al. variants on identical folds.</w:t>
       </w:r>
     </w:p>
-    <w:bookmarkEnd w:id="45"/>
-    <w:bookmarkStart w:id="46" w:name="shkuratov-model-inversion-25"/>
+    <w:bookmarkEnd w:id="44"/>
+    <w:bookmarkStart w:id="45" w:name="shkuratov-model-inversion-25"/>
     <w:p>
       <w:pPr>
         <w:pStyle w:val="Heading4"/>
@@ -10902,8 +10884,8 @@
         </w:tc>
       </w:tr>
     </w:tbl>
-    <w:bookmarkEnd w:id="46"/>
-    <w:bookmarkStart w:id="47" w:name="hapkebayesian-inversion-26"/>
+    <w:bookmarkEnd w:id="45"/>
+    <w:bookmarkStart w:id="46" w:name="hapkebayesian-inversion-26"/>
     <w:p>
       <w:pPr>
         <w:pStyle w:val="Heading4"/>
@@ -11032,9 +11014,9 @@
         <w:t xml:space="preserve">r = 0.99, against r ≈ 0.00 for the inversion’s maturity index.</w:t>
       </w:r>
     </w:p>
+    <w:bookmarkEnd w:id="46"/>
     <w:bookmarkEnd w:id="47"/>
-    <w:bookmarkEnd w:id="48"/>
-    <w:bookmarkStart w:id="52" w:name="uncertainty-and-identifiability-1"/>
+    <w:bookmarkStart w:id="51" w:name="uncertainty-and-identifiability-1"/>
     <w:p>
       <w:pPr>
         <w:pStyle w:val="Heading3"/>
@@ -11885,18 +11867,18 @@
           <wp:inline>
             <wp:extent cx="5334000" cy="2425810"/>
             <wp:effectExtent b="0" l="0" r="0" t="0"/>
-            <wp:docPr descr="Figure 4" title="" id="50" name="Picture"/>
+            <wp:docPr descr="Figure 4" title="" id="49" name="Picture"/>
             <a:graphic>
               <a:graphicData uri="http://schemas.openxmlformats.org/drawingml/2006/picture">
                 <pic:pic>
                   <pic:nvPicPr>
-                    <pic:cNvPr descr="../figures/step05_coverage.png" id="51" name="Picture"/>
+                    <pic:cNvPr descr="../figures/step05_coverage.png" id="50" name="Picture"/>
                     <pic:cNvPicPr>
                       <a:picLocks noChangeArrowheads="1" noChangeAspect="1"/>
                     </pic:cNvPicPr>
                   </pic:nvPicPr>
                   <pic:blipFill>
-                    <a:blip r:embed="rId49"/>
+                    <a:blip r:embed="rId48"/>
                     <a:stretch>
                       <a:fillRect/>
                     </a:stretch>
@@ -11955,8 +11937,8 @@
         <w:t xml:space="preserve">conformal calibration, under LOSO and LOMO.</w:t>
       </w:r>
     </w:p>
-    <w:bookmarkEnd w:id="52"/>
-    <w:bookmarkStart w:id="56" w:name="X034a0d09804bb4b649341f37bd1cca15b9e3449"/>
+    <w:bookmarkEnd w:id="51"/>
+    <w:bookmarkStart w:id="55" w:name="X034a0d09804bb4b649341f37bd1cca15b9e3449"/>
     <w:p>
       <w:pPr>
         <w:pStyle w:val="Heading3"/>
@@ -14227,18 +14209,18 @@
           <wp:inline>
             <wp:extent cx="5334000" cy="1879600"/>
             <wp:effectExtent b="0" l="0" r="0" t="0"/>
-            <wp:docPr descr="Figure 5" title="" id="54" name="Picture"/>
+            <wp:docPr descr="Figure 5" title="" id="53" name="Picture"/>
             <a:graphic>
               <a:graphicData uri="http://schemas.openxmlformats.org/drawingml/2006/picture">
                 <pic:pic>
                   <pic:nvPicPr>
-                    <pic:cNvPr descr="../figures/fig05_m3_sites.png" id="55" name="Picture"/>
+                    <pic:cNvPr descr="../figures/fig05_m3_sites.png" id="54" name="Picture"/>
                     <pic:cNvPicPr>
                       <a:picLocks noChangeArrowheads="1" noChangeAspect="1"/>
                     </pic:cNvPicPr>
                   </pic:nvPicPr>
                   <pic:blipFill>
-                    <a:blip r:embed="rId53"/>
+                    <a:blip r:embed="rId52"/>
                     <a:stretch>
                       <a:fillRect/>
                     </a:stretch>
@@ -14303,8 +14285,8 @@
         <w:t xml:space="preserve">Marker shape gives the landing site; the line is 1:1.</w:t>
       </w:r>
     </w:p>
-    <w:bookmarkEnd w:id="56"/>
-    <w:bookmarkStart w:id="57" w:name="ablations-and-parameter-analysis"/>
+    <w:bookmarkEnd w:id="55"/>
+    <w:bookmarkStart w:id="56" w:name="ablations-and-parameter-analysis"/>
     <w:p>
       <w:pPr>
         <w:pStyle w:val="Heading3"/>
@@ -16421,8 +16403,8 @@
         </w:tc>
       </w:tr>
     </w:tbl>
-    <w:bookmarkEnd w:id="57"/>
-    <w:bookmarkStart w:id="61" w:name="application-to-m³-scenes"/>
+    <w:bookmarkEnd w:id="56"/>
+    <w:bookmarkStart w:id="60" w:name="application-to-m³-scenes"/>
     <w:p>
       <w:pPr>
         <w:pStyle w:val="Heading3"/>
@@ -16600,18 +16582,18 @@
           <wp:inline>
             <wp:extent cx="5334000" cy="3146822"/>
             <wp:effectExtent b="0" l="0" r="0" t="0"/>
-            <wp:docPr descr="Figure 6" title="" id="59" name="Picture"/>
+            <wp:docPr descr="Figure 6" title="" id="58" name="Picture"/>
             <a:graphic>
               <a:graphicData uri="http://schemas.openxmlformats.org/drawingml/2006/picture">
                 <pic:pic>
                   <pic:nvPicPr>
-                    <pic:cNvPr descr="../figures/step07_shapley_maps.png" id="60" name="Picture"/>
+                    <pic:cNvPr descr="../figures/step07_shapley_maps.png" id="59" name="Picture"/>
                     <pic:cNvPicPr>
                       <a:picLocks noChangeArrowheads="1" noChangeAspect="1"/>
                     </pic:cNvPicPr>
                   </pic:nvPicPr>
                   <pic:blipFill>
-                    <a:blip r:embed="rId58"/>
+                    <a:blip r:embed="rId57"/>
                     <a:stretch>
                       <a:fillRect/>
                     </a:stretch>
@@ -16676,9 +16658,9 @@
         <w:t xml:space="preserve">are withheld by the identifiability gate.</w:t>
       </w:r>
     </w:p>
+    <w:bookmarkEnd w:id="60"/>
     <w:bookmarkEnd w:id="61"/>
-    <w:bookmarkEnd w:id="62"/>
-    <w:bookmarkStart w:id="68" w:name="discussion"/>
+    <w:bookmarkStart w:id="67" w:name="discussion"/>
     <w:p>
       <w:pPr>
         <w:pStyle w:val="Heading2"/>
@@ -16687,7 +16669,7 @@
         <w:t xml:space="preserve">4. Discussion</w:t>
       </w:r>
     </w:p>
-    <w:bookmarkStart w:id="63" w:name="Xe6bde06f441fb128f62d0026fd42eb65b450b2f"/>
+    <w:bookmarkStart w:id="62" w:name="Xe6bde06f441fb128f62d0026fd42eb65b450b2f"/>
     <w:p>
       <w:pPr>
         <w:pStyle w:val="Heading3"/>
@@ -16986,8 +16968,8 @@
         <w:t xml:space="preserve">seeing the results.</w:t>
       </w:r>
     </w:p>
-    <w:bookmarkEnd w:id="63"/>
-    <w:bookmarkStart w:id="64" w:name="X89b6e2467fefe970bb4c0345a8d1bb09cf146cc"/>
+    <w:bookmarkEnd w:id="62"/>
+    <w:bookmarkStart w:id="63" w:name="X89b6e2467fefe970bb4c0345a8d1bb09cf146cc"/>
     <w:p>
       <w:pPr>
         <w:pStyle w:val="Heading3"/>
@@ -17120,8 +17102,8 @@
         <w:t xml:space="preserve">This is a concrete and practically relevant difference.</w:t>
       </w:r>
     </w:p>
-    <w:bookmarkEnd w:id="64"/>
-    <w:bookmarkStart w:id="65" w:name="X239668b55a24bc6056d13e4b7f00680a51642c0"/>
+    <w:bookmarkEnd w:id="63"/>
+    <w:bookmarkStart w:id="64" w:name="X239668b55a24bc6056d13e4b7f00680a51642c0"/>
     <w:p>
       <w:pPr>
         <w:pStyle w:val="Heading3"/>
@@ -17492,8 +17474,8 @@
         <w:t xml:space="preserve">- on the unflagged targets, LUMEN reproduces the expected mare–highland contrasts.</w:t>
       </w:r>
     </w:p>
-    <w:bookmarkEnd w:id="65"/>
-    <w:bookmarkStart w:id="66" w:name="uncertainty-and-identifiability-2"/>
+    <w:bookmarkEnd w:id="64"/>
+    <w:bookmarkStart w:id="65" w:name="uncertainty-and-identifiability-2"/>
     <w:p>
       <w:pPr>
         <w:pStyle w:val="Heading3"/>
@@ -17616,8 +17598,8 @@
         <w:t xml:space="preserve">claim that olivine is undetectable where it is abundant.</w:t>
       </w:r>
     </w:p>
-    <w:bookmarkEnd w:id="66"/>
-    <w:bookmarkStart w:id="67" w:name="limitations"/>
+    <w:bookmarkEnd w:id="65"/>
+    <w:bookmarkStart w:id="66" w:name="limitations"/>
     <w:p>
       <w:pPr>
         <w:pStyle w:val="Heading3"/>
@@ -17818,9 +17800,9 @@
         <w:t xml:space="preserve">Chandrayaan-2 IIRS, whose radiometry and band set differ, is not tested here.</w:t>
       </w:r>
     </w:p>
+    <w:bookmarkEnd w:id="66"/>
     <w:bookmarkEnd w:id="67"/>
-    <w:bookmarkEnd w:id="68"/>
-    <w:bookmarkStart w:id="69" w:name="conclusions"/>
+    <w:bookmarkStart w:id="68" w:name="conclusions"/>
     <w:p>
       <w:pPr>
         <w:pStyle w:val="Heading2"/>
@@ -18566,8 +18548,8 @@
         </w:tc>
       </w:tr>
     </w:tbl>
-    <w:bookmarkEnd w:id="69"/>
-    <w:bookmarkStart w:id="70" w:name="references"/>
+    <w:bookmarkEnd w:id="68"/>
+    <w:bookmarkStart w:id="69" w:name="references"/>
     <w:p>
       <w:pPr>
         <w:pStyle w:val="Heading2"/>
@@ -20378,8 +20360,8 @@
         <w:t xml:space="preserve">, 65–70.</w:t>
       </w:r>
     </w:p>
+    <w:bookmarkEnd w:id="69"/>
     <w:bookmarkEnd w:id="70"/>
-    <w:bookmarkEnd w:id="71"/>
     <w:sectPr>
       <w:footnotePr>
         <w:numRestart w:val="eachSect"/>

</xml_diff>